<commit_message>
Split between Cat e ML training. Added ML comparison between different machines. Code Debugged compared to the no class version
</commit_message>
<xml_diff>
--- a/Paper/Paper_HP_simplified_models_VS.1.0.docx
+++ b/Paper/Paper_HP_simplified_models_VS.1.0.docx
@@ -131,7 +131,21 @@
         <w:rPr>
           <w:rFonts w:ascii="Cambria" w:hAnsi="Cambria" w:cs="Times New Roman"/>
         </w:rPr>
-        <w:t xml:space="preserve"> operative points (maybe plot a graph of the fcop vs PLR?).</w:t>
+        <w:t xml:space="preserve"> operative points (maybe plot a graph of the </w:t>
+      </w:r>
+      <w:proofErr w:type="spellStart"/>
+      <w:r>
+        <w:rPr>
+          <w:rFonts w:ascii="Cambria" w:hAnsi="Cambria" w:cs="Times New Roman"/>
+        </w:rPr>
+        <w:t>fcop</w:t>
+      </w:r>
+      <w:proofErr w:type="spellEnd"/>
+      <w:r>
+        <w:rPr>
+          <w:rFonts w:ascii="Cambria" w:hAnsi="Cambria" w:cs="Times New Roman"/>
+        </w:rPr>
+        <w:t xml:space="preserve"> vs PLR?).</w:t>
       </w:r>
     </w:p>
     <w:p>
@@ -247,7 +261,35 @@
         <w:rPr>
           <w:rFonts w:ascii="Cambria" w:hAnsi="Cambria" w:cs="Times New Roman"/>
         </w:rPr>
-        <w:t>5% Pow_DES  =&gt; Unit OFF</w:t>
+        <w:t xml:space="preserve">5% </w:t>
+      </w:r>
+      <w:proofErr w:type="spellStart"/>
+      <w:r>
+        <w:rPr>
+          <w:rFonts w:ascii="Cambria" w:hAnsi="Cambria" w:cs="Times New Roman"/>
+        </w:rPr>
+        <w:t>Pow_</w:t>
+      </w:r>
+      <w:proofErr w:type="gramStart"/>
+      <w:r>
+        <w:rPr>
+          <w:rFonts w:ascii="Cambria" w:hAnsi="Cambria" w:cs="Times New Roman"/>
+        </w:rPr>
+        <w:t>DES</w:t>
+      </w:r>
+      <w:proofErr w:type="spellEnd"/>
+      <w:r>
+        <w:rPr>
+          <w:rFonts w:ascii="Cambria" w:hAnsi="Cambria" w:cs="Times New Roman"/>
+        </w:rPr>
+        <w:t xml:space="preserve">  =</w:t>
+      </w:r>
+      <w:proofErr w:type="gramEnd"/>
+      <w:r>
+        <w:rPr>
+          <w:rFonts w:ascii="Cambria" w:hAnsi="Cambria" w:cs="Times New Roman"/>
+        </w:rPr>
+        <w:t>&gt; Unit OFF</w:t>
       </w:r>
     </w:p>
     <w:p>
@@ -303,27 +345,69 @@
         <w:rPr>
           <w:rFonts w:ascii="Cambria" w:hAnsi="Cambria" w:cs="Times New Roman"/>
         </w:rPr>
-        <w:t>and AtW =&gt; Defrost. (Can be improved considering the external temperatures/ umidity?)</w:t>
-      </w:r>
-    </w:p>
-    <w:p>
-      <w:pPr>
-        <w:rPr>
-          <w:rFonts w:ascii="Cambria" w:hAnsi="Cambria" w:cs="Times New Roman"/>
-        </w:rPr>
-      </w:pPr>
-    </w:p>
-    <w:p>
-      <w:pPr>
-        <w:rPr>
-          <w:rFonts w:ascii="Cambria" w:hAnsi="Cambria" w:cs="Times New Roman"/>
-        </w:rPr>
-      </w:pPr>
-      <w:r>
-        <w:rPr>
-          <w:rFonts w:ascii="Cambria" w:hAnsi="Cambria" w:cs="Times New Roman"/>
-        </w:rPr>
-        <w:t>For AtW:</w:t>
+        <w:t xml:space="preserve">and </w:t>
+      </w:r>
+      <w:proofErr w:type="spellStart"/>
+      <w:r>
+        <w:rPr>
+          <w:rFonts w:ascii="Cambria" w:hAnsi="Cambria" w:cs="Times New Roman"/>
+        </w:rPr>
+        <w:t>AtW</w:t>
+      </w:r>
+      <w:proofErr w:type="spellEnd"/>
+      <w:r>
+        <w:rPr>
+          <w:rFonts w:ascii="Cambria" w:hAnsi="Cambria" w:cs="Times New Roman"/>
+        </w:rPr>
+        <w:t xml:space="preserve"> =&gt; Defrost. (Can be improved considering the external temperatures/ </w:t>
+      </w:r>
+      <w:proofErr w:type="spellStart"/>
+      <w:r>
+        <w:rPr>
+          <w:rFonts w:ascii="Cambria" w:hAnsi="Cambria" w:cs="Times New Roman"/>
+        </w:rPr>
+        <w:t>umidity</w:t>
+      </w:r>
+      <w:proofErr w:type="spellEnd"/>
+      <w:r>
+        <w:rPr>
+          <w:rFonts w:ascii="Cambria" w:hAnsi="Cambria" w:cs="Times New Roman"/>
+        </w:rPr>
+        <w:t>?)</w:t>
+      </w:r>
+    </w:p>
+    <w:p>
+      <w:pPr>
+        <w:rPr>
+          <w:rFonts w:ascii="Cambria" w:hAnsi="Cambria" w:cs="Times New Roman"/>
+        </w:rPr>
+      </w:pPr>
+    </w:p>
+    <w:p>
+      <w:pPr>
+        <w:rPr>
+          <w:rFonts w:ascii="Cambria" w:hAnsi="Cambria" w:cs="Times New Roman"/>
+        </w:rPr>
+      </w:pPr>
+      <w:r>
+        <w:rPr>
+          <w:rFonts w:ascii="Cambria" w:hAnsi="Cambria" w:cs="Times New Roman"/>
+        </w:rPr>
+        <w:t xml:space="preserve">For </w:t>
+      </w:r>
+      <w:proofErr w:type="spellStart"/>
+      <w:r>
+        <w:rPr>
+          <w:rFonts w:ascii="Cambria" w:hAnsi="Cambria" w:cs="Times New Roman"/>
+        </w:rPr>
+        <w:t>AtW</w:t>
+      </w:r>
+      <w:proofErr w:type="spellEnd"/>
+      <w:r>
+        <w:rPr>
+          <w:rFonts w:ascii="Cambria" w:hAnsi="Cambria" w:cs="Times New Roman"/>
+        </w:rPr>
+        <w:t>:</w:t>
       </w:r>
     </w:p>
     <w:p>
@@ -752,7 +836,21 @@
         <w:rPr>
           <w:rFonts w:ascii="Cambria" w:hAnsi="Cambria" w:cs="Times New Roman"/>
         </w:rPr>
-        <w:t>For WtW:</w:t>
+        <w:t xml:space="preserve">For </w:t>
+      </w:r>
+      <w:proofErr w:type="spellStart"/>
+      <w:r>
+        <w:rPr>
+          <w:rFonts w:ascii="Cambria" w:hAnsi="Cambria" w:cs="Times New Roman"/>
+        </w:rPr>
+        <w:t>WtW</w:t>
+      </w:r>
+      <w:proofErr w:type="spellEnd"/>
+      <w:r>
+        <w:rPr>
+          <w:rFonts w:ascii="Cambria" w:hAnsi="Cambria" w:cs="Times New Roman"/>
+        </w:rPr>
+        <w:t>:</w:t>
       </w:r>
     </w:p>
     <w:p>
@@ -927,13 +1025,7 @@
                     <w:rPr>
                       <w:rFonts w:ascii="Cambria Math" w:hAnsi="Cambria Math" w:cs="Times New Roman"/>
                     </w:rPr>
-                    <m:t xml:space="preserve">ACC               if </m:t>
-                  </m:r>
-                  <m:r>
-                    <w:rPr>
-                      <w:rFonts w:ascii="Cambria Math" w:hAnsi="Cambria Math" w:cs="Times New Roman"/>
-                    </w:rPr>
-                    <m:t xml:space="preserve"> </m:t>
+                    <m:t xml:space="preserve">ACC               if  </m:t>
                   </m:r>
                   <m:f>
                     <m:fPr>
@@ -1051,13 +1143,7 @@
                     <w:rPr>
                       <w:rFonts w:ascii="Cambria Math" w:hAnsi="Cambria Math" w:cs="Times New Roman"/>
                     </w:rPr>
-                    <m:t xml:space="preserve">DECC               if </m:t>
-                  </m:r>
-                  <m:r>
-                    <w:rPr>
-                      <w:rFonts w:ascii="Cambria Math" w:hAnsi="Cambria Math" w:cs="Times New Roman"/>
-                    </w:rPr>
-                    <m:t xml:space="preserve"> </m:t>
+                    <m:t xml:space="preserve">DECC               if  </m:t>
                   </m:r>
                   <m:f>
                     <m:fPr>
@@ -1226,20 +1312,51 @@
           <w:rFonts w:ascii="Cambria" w:hAnsi="Cambria" w:cs="Times New Roman"/>
           <w:highlight w:val="yellow"/>
         </w:rPr>
-        <w:t xml:space="preserve"> The rule is less precise with WtW machine despite the strict functioning band.</w:t>
-      </w:r>
-      <w:r>
-        <w:rPr>
-          <w:rFonts w:ascii="Cambria" w:hAnsi="Cambria" w:cs="Times New Roman"/>
-        </w:rPr>
-        <w:t xml:space="preserve"> Maybe there could be a better strategy to evaluate the different status conditions ( </w:t>
-      </w:r>
+        <w:t xml:space="preserve"> The rule is less precise with </w:t>
+      </w:r>
+      <w:proofErr w:type="spellStart"/>
       <w:r>
         <w:rPr>
           <w:rFonts w:ascii="Cambria" w:hAnsi="Cambria" w:cs="Times New Roman"/>
           <w:highlight w:val="yellow"/>
         </w:rPr>
-        <w:t>Temporal convolution analysis</w:t>
+        <w:t>WtW</w:t>
+      </w:r>
+      <w:proofErr w:type="spellEnd"/>
+      <w:r>
+        <w:rPr>
+          <w:rFonts w:ascii="Cambria" w:hAnsi="Cambria" w:cs="Times New Roman"/>
+          <w:highlight w:val="yellow"/>
+        </w:rPr>
+        <w:t xml:space="preserve"> machine despite the strict functioning band.</w:t>
+      </w:r>
+      <w:r>
+        <w:rPr>
+          <w:rFonts w:ascii="Cambria" w:hAnsi="Cambria" w:cs="Times New Roman"/>
+        </w:rPr>
+        <w:t xml:space="preserve"> Maybe there could be a better strategy to evaluate the different status conditions </w:t>
+      </w:r>
+      <w:proofErr w:type="gramStart"/>
+      <w:r>
+        <w:rPr>
+          <w:rFonts w:ascii="Cambria" w:hAnsi="Cambria" w:cs="Times New Roman"/>
+        </w:rPr>
+        <w:t xml:space="preserve">( </w:t>
+      </w:r>
+      <w:r>
+        <w:rPr>
+          <w:rFonts w:ascii="Cambria" w:hAnsi="Cambria" w:cs="Times New Roman"/>
+          <w:highlight w:val="yellow"/>
+        </w:rPr>
+        <w:t>Temporal</w:t>
+      </w:r>
+      <w:proofErr w:type="gramEnd"/>
+      <w:r>
+        <w:rPr>
+          <w:rFonts w:ascii="Cambria" w:hAnsi="Cambria" w:cs="Times New Roman"/>
+          <w:highlight w:val="yellow"/>
+        </w:rPr>
+        <w:t xml:space="preserve"> convolution analysis</w:t>
       </w:r>
       <w:r>
         <w:rPr>
@@ -1323,58 +1440,25 @@
         <w:rPr>
           <w:rFonts w:ascii="Cambria" w:hAnsi="Cambria" w:cs="Times New Roman"/>
         </w:rPr>
-        <w:t>behaviour and STATUS Analysis of one AtW unit</w:t>
-      </w:r>
-    </w:p>
-    <w:p>
-      <w:pPr>
-        <w:jc w:val="center"/>
-        <w:rPr>
-          <w:rFonts w:ascii="Cambria" w:hAnsi="Cambria" w:cs="Times New Roman"/>
-        </w:rPr>
-      </w:pPr>
-    </w:p>
-    <w:p>
-      <w:pPr>
-        <w:jc w:val="center"/>
-        <w:rPr>
-          <w:rFonts w:ascii="Cambria" w:hAnsi="Cambria" w:cs="Times New Roman"/>
-        </w:rPr>
-      </w:pPr>
-      <w:r>
-        <w:rPr>
-          <w:rFonts w:ascii="Cambria" w:hAnsi="Cambria" w:cs="Times New Roman"/>
-          <w:b/>
-          <w:bCs/>
-        </w:rPr>
-        <w:t xml:space="preserve">Figure </w:t>
-      </w:r>
-      <w:r>
-        <w:rPr>
-          <w:rFonts w:ascii="Cambria" w:hAnsi="Cambria" w:cs="Times New Roman"/>
-          <w:b/>
-          <w:bCs/>
-        </w:rPr>
-        <w:t>2</w:t>
-      </w:r>
-      <w:r>
-        <w:rPr>
-          <w:rFonts w:ascii="Cambria" w:hAnsi="Cambria" w:cs="Times New Roman"/>
-          <w:b/>
-          <w:bCs/>
-        </w:rPr>
-        <w:t xml:space="preserve">. </w:t>
-      </w:r>
-      <w:r>
-        <w:rPr>
-          <w:rFonts w:ascii="Cambria" w:hAnsi="Cambria" w:cs="Times New Roman"/>
-        </w:rPr>
-        <w:t>Time behaviour and STATUS Analysis of one WtW unit.</w:t>
-      </w:r>
-    </w:p>
-    <w:p>
-      <w:pPr>
-        <w:jc w:val="center"/>
+        <w:t xml:space="preserve">behaviour and STATUS Analysis of one </w:t>
+      </w:r>
+      <w:proofErr w:type="spellStart"/>
+      <w:r>
+        <w:rPr>
+          <w:rFonts w:ascii="Cambria" w:hAnsi="Cambria" w:cs="Times New Roman"/>
+        </w:rPr>
+        <w:t>AtW</w:t>
+      </w:r>
+      <w:proofErr w:type="spellEnd"/>
+      <w:r>
+        <w:rPr>
+          <w:rFonts w:ascii="Cambria" w:hAnsi="Cambria" w:cs="Times New Roman"/>
+        </w:rPr>
+        <w:t xml:space="preserve"> unit</w:t>
+      </w:r>
+    </w:p>
+    <w:p>
+      <w:pPr>
         <w:rPr>
           <w:rFonts w:ascii="Cambria" w:hAnsi="Cambria" w:cs="Times New Roman"/>
         </w:rPr>
@@ -1442,7 +1526,21 @@
         <w:rPr>
           <w:rFonts w:ascii="Cambria" w:hAnsi="Cambria" w:cs="Times New Roman"/>
         </w:rPr>
-        <w:t>. The full load calculation is a mandatory step in order to calculate the partial load ratio, expressed as:</w:t>
+        <w:t xml:space="preserve">. The full load calculation is a mandatory step </w:t>
+      </w:r>
+      <w:proofErr w:type="gramStart"/>
+      <w:r>
+        <w:rPr>
+          <w:rFonts w:ascii="Cambria" w:hAnsi="Cambria" w:cs="Times New Roman"/>
+        </w:rPr>
+        <w:t>in order to</w:t>
+      </w:r>
+      <w:proofErr w:type="gramEnd"/>
+      <w:r>
+        <w:rPr>
+          <w:rFonts w:ascii="Cambria" w:hAnsi="Cambria" w:cs="Times New Roman"/>
+        </w:rPr>
+        <w:t xml:space="preserve"> calculate the partial load ratio, expressed as:</w:t>
       </w:r>
     </w:p>
     <w:tbl>
@@ -2187,7 +2285,21 @@
         <w:rPr>
           <w:rFonts w:ascii="Cambria" w:eastAsiaTheme="minorEastAsia" w:hAnsi="Cambria" w:cs="Times New Roman"/>
         </w:rPr>
-        <w:t xml:space="preserve"> Residuals are calculated using statsmodel </w:t>
+        <w:t xml:space="preserve"> Residuals are calculated using </w:t>
+      </w:r>
+      <w:proofErr w:type="spellStart"/>
+      <w:r>
+        <w:rPr>
+          <w:rFonts w:ascii="Cambria" w:eastAsiaTheme="minorEastAsia" w:hAnsi="Cambria" w:cs="Times New Roman"/>
+        </w:rPr>
+        <w:t>statsmodel</w:t>
+      </w:r>
+      <w:proofErr w:type="spellEnd"/>
+      <w:r>
+        <w:rPr>
+          <w:rFonts w:ascii="Cambria" w:eastAsiaTheme="minorEastAsia" w:hAnsi="Cambria" w:cs="Times New Roman"/>
+        </w:rPr>
+        <w:t xml:space="preserve"> </w:t>
       </w:r>
       <w:r>
         <w:rPr>
@@ -2248,7 +2360,21 @@
         <w:rPr>
           <w:rFonts w:ascii="Cambria" w:eastAsiaTheme="minorEastAsia" w:hAnsi="Cambria" w:cs="Times New Roman"/>
         </w:rPr>
-        <w:t xml:space="preserve">. The results on the final </w:t>
+        <w:t xml:space="preserve">. The </w:t>
+      </w:r>
+      <w:proofErr w:type="gramStart"/>
+      <w:r>
+        <w:rPr>
+          <w:rFonts w:ascii="Cambria" w:eastAsiaTheme="minorEastAsia" w:hAnsi="Cambria" w:cs="Times New Roman"/>
+        </w:rPr>
+        <w:t>results</w:t>
+      </w:r>
+      <w:proofErr w:type="gramEnd"/>
+      <w:r>
+        <w:rPr>
+          <w:rFonts w:ascii="Cambria" w:eastAsiaTheme="minorEastAsia" w:hAnsi="Cambria" w:cs="Times New Roman"/>
+        </w:rPr>
+        <w:t xml:space="preserve"> on the final </w:t>
       </w:r>
       <w:r>
         <w:rPr>
@@ -2264,47 +2390,6 @@
           <w:rFonts w:ascii="Cambria" w:eastAsiaTheme="minorEastAsia" w:hAnsi="Cambria" w:cs="Times New Roman"/>
         </w:rPr>
       </w:pPr>
-      <w:r>
-        <w:rPr>
-          <w:rFonts w:ascii="Cambria" w:eastAsiaTheme="minorEastAsia" w:hAnsi="Cambria" w:cs="Times New Roman"/>
-        </w:rPr>
-        <w:lastRenderedPageBreak/>
-        <w:drawing>
-          <wp:inline distT="0" distB="0" distL="0" distR="0" wp14:anchorId="7800F763" wp14:editId="7DD92593">
-            <wp:extent cx="5865963" cy="2906810"/>
-            <wp:effectExtent l="0" t="0" r="1905" b="8255"/>
-            <wp:docPr id="2033101498" name="Immagine 1" descr="Immagine che contiene testo, Diagramma, diagramma, schermata&#10;&#10;Il contenuto generato dall'IA potrebbe non essere corretto."/>
-            <wp:cNvGraphicFramePr>
-              <a:graphicFrameLocks xmlns:a="http://schemas.openxmlformats.org/drawingml/2006/main" noChangeAspect="1"/>
-            </wp:cNvGraphicFramePr>
-            <a:graphic xmlns:a="http://schemas.openxmlformats.org/drawingml/2006/main">
-              <a:graphicData uri="http://schemas.openxmlformats.org/drawingml/2006/picture">
-                <pic:pic xmlns:pic="http://schemas.openxmlformats.org/drawingml/2006/picture">
-                  <pic:nvPicPr>
-                    <pic:cNvPr id="2033101498" name="Immagine 1" descr="Immagine che contiene testo, Diagramma, diagramma, schermata&#10;&#10;Il contenuto generato dall'IA potrebbe non essere corretto."/>
-                    <pic:cNvPicPr/>
-                  </pic:nvPicPr>
-                  <pic:blipFill>
-                    <a:blip r:embed="rId6"/>
-                    <a:stretch>
-                      <a:fillRect/>
-                    </a:stretch>
-                  </pic:blipFill>
-                  <pic:spPr>
-                    <a:xfrm>
-                      <a:off x="0" y="0"/>
-                      <a:ext cx="5868292" cy="2907964"/>
-                    </a:xfrm>
-                    <a:prstGeom prst="rect">
-                      <a:avLst/>
-                    </a:prstGeom>
-                  </pic:spPr>
-                </pic:pic>
-              </a:graphicData>
-            </a:graphic>
-          </wp:inline>
-        </w:drawing>
-      </w:r>
     </w:p>
     <w:p>
       <w:pPr>
@@ -2313,46 +2398,6 @@
           <w:rFonts w:ascii="Cambria" w:eastAsiaTheme="minorEastAsia" w:hAnsi="Cambria" w:cs="Times New Roman"/>
         </w:rPr>
       </w:pPr>
-      <w:r>
-        <w:rPr>
-          <w:rFonts w:ascii="Cambria" w:eastAsiaTheme="minorEastAsia" w:hAnsi="Cambria" w:cs="Times New Roman"/>
-        </w:rPr>
-        <w:drawing>
-          <wp:inline distT="0" distB="0" distL="0" distR="0" wp14:anchorId="5D8DF1E8" wp14:editId="0956726C">
-            <wp:extent cx="6120130" cy="2983865"/>
-            <wp:effectExtent l="0" t="0" r="0" b="6985"/>
-            <wp:docPr id="357370103" name="Immagine 1" descr="Immagine che contiene testo, schermata, Diagramma, diagramma&#10;&#10;Il contenuto generato dall'IA potrebbe non essere corretto."/>
-            <wp:cNvGraphicFramePr>
-              <a:graphicFrameLocks xmlns:a="http://schemas.openxmlformats.org/drawingml/2006/main" noChangeAspect="1"/>
-            </wp:cNvGraphicFramePr>
-            <a:graphic xmlns:a="http://schemas.openxmlformats.org/drawingml/2006/main">
-              <a:graphicData uri="http://schemas.openxmlformats.org/drawingml/2006/picture">
-                <pic:pic xmlns:pic="http://schemas.openxmlformats.org/drawingml/2006/picture">
-                  <pic:nvPicPr>
-                    <pic:cNvPr id="357370103" name="Immagine 1" descr="Immagine che contiene testo, schermata, Diagramma, diagramma&#10;&#10;Il contenuto generato dall'IA potrebbe non essere corretto."/>
-                    <pic:cNvPicPr/>
-                  </pic:nvPicPr>
-                  <pic:blipFill>
-                    <a:blip r:embed="rId7"/>
-                    <a:stretch>
-                      <a:fillRect/>
-                    </a:stretch>
-                  </pic:blipFill>
-                  <pic:spPr>
-                    <a:xfrm>
-                      <a:off x="0" y="0"/>
-                      <a:ext cx="6120130" cy="2983865"/>
-                    </a:xfrm>
-                    <a:prstGeom prst="rect">
-                      <a:avLst/>
-                    </a:prstGeom>
-                  </pic:spPr>
-                </pic:pic>
-              </a:graphicData>
-            </a:graphic>
-          </wp:inline>
-        </w:drawing>
-      </w:r>
     </w:p>
     <w:p>
       <w:pPr>
@@ -2372,6 +2417,7 @@
       <w:r>
         <w:rPr>
           <w:rFonts w:ascii="Cambria" w:hAnsi="Cambria" w:cs="Times New Roman"/>
+          <w:noProof/>
         </w:rPr>
         <w:lastRenderedPageBreak/>
         <w:drawing>
@@ -2390,7 +2436,7 @@
                     <pic:cNvPicPr/>
                   </pic:nvPicPr>
                   <pic:blipFill>
-                    <a:blip r:embed="rId8"/>
+                    <a:blip r:embed="rId6"/>
                     <a:stretch>
                       <a:fillRect/>
                     </a:stretch>
@@ -2432,7 +2478,7 @@
           <w:b/>
           <w:bCs/>
         </w:rPr>
-        <w:t>3</w:t>
+        <w:t>2</w:t>
       </w:r>
       <w:r>
         <w:rPr>
@@ -2458,13 +2504,13 @@
         <w:rPr>
           <w:rFonts w:ascii="Cambria" w:hAnsi="Cambria" w:cs="Times New Roman"/>
         </w:rPr>
-        <w:t xml:space="preserve"> NIBE 2050 and</w:t>
-      </w:r>
-      <w:r>
-        <w:rPr>
-          <w:rFonts w:ascii="Cambria" w:hAnsi="Cambria" w:cs="Times New Roman"/>
-        </w:rPr>
-        <w:t xml:space="preserve"> RIELLO</w:t>
+        <w:t xml:space="preserve"> </w:t>
+      </w:r>
+      <w:r>
+        <w:rPr>
+          <w:rFonts w:ascii="Cambria" w:hAnsi="Cambria" w:cs="Times New Roman"/>
+        </w:rPr>
+        <w:t>RIELLO</w:t>
       </w:r>
       <w:r>
         <w:rPr>
@@ -2592,13 +2638,7 @@
             <w:rPr>
               <w:rFonts w:ascii="Cambria Math" w:hAnsi="Cambria Math" w:cs="Times New Roman"/>
             </w:rPr>
-            <m:t>∝</m:t>
-          </m:r>
-          <m:r>
-            <w:rPr>
-              <w:rFonts w:ascii="Cambria Math" w:hAnsi="Cambria Math" w:cs="Times New Roman"/>
-            </w:rPr>
-            <m:t>(</m:t>
+            <m:t>∝(</m:t>
           </m:r>
           <m:r>
             <m:rPr>
@@ -2613,13 +2653,7 @@
             <w:rPr>
               <w:rFonts w:ascii="Cambria Math" w:hAnsi="Cambria Math" w:cs="Times New Roman"/>
             </w:rPr>
-            <m:t>T</m:t>
-          </m:r>
-          <m:r>
-            <w:rPr>
-              <w:rFonts w:ascii="Cambria Math" w:hAnsi="Cambria Math" w:cs="Times New Roman"/>
-            </w:rPr>
-            <m:t xml:space="preserve">+ </m:t>
+            <m:t xml:space="preserve">T+ </m:t>
           </m:r>
           <m:r>
             <m:rPr>
@@ -2684,19 +2718,7 @@
                 <w:rPr>
                   <w:rFonts w:ascii="Cambria Math" w:hAnsi="Cambria Math" w:cs="Times New Roman"/>
                 </w:rPr>
-                <m:t>ref,</m:t>
-              </m:r>
-              <m:r>
-                <w:rPr>
-                  <w:rFonts w:ascii="Cambria Math" w:hAnsi="Cambria Math" w:cs="Times New Roman"/>
-                </w:rPr>
-                <m:t>p</m:t>
-              </m:r>
-              <m:r>
-                <w:rPr>
-                  <w:rFonts w:ascii="Cambria Math" w:hAnsi="Cambria Math" w:cs="Times New Roman"/>
-                </w:rPr>
-                <m:t>l</m:t>
+                <m:t>ref,pl</m:t>
               </m:r>
             </m:sub>
           </m:sSub>
@@ -2748,19 +2770,7 @@
             <w:rPr>
               <w:rFonts w:ascii="Cambria Math" w:hAnsi="Cambria Math" w:cs="Times New Roman"/>
             </w:rPr>
-            <m:t xml:space="preserve"> </m:t>
-          </m:r>
-          <m:r>
-            <w:rPr>
-              <w:rFonts w:ascii="Cambria Math" w:hAnsi="Cambria Math" w:cs="Times New Roman"/>
-            </w:rPr>
-            <m:t>∝</m:t>
-          </m:r>
-          <m:r>
-            <w:rPr>
-              <w:rFonts w:ascii="Cambria Math" w:hAnsi="Cambria Math" w:cs="Times New Roman"/>
-            </w:rPr>
-            <m:t>(</m:t>
+            <m:t xml:space="preserve"> ∝(</m:t>
           </m:r>
           <m:r>
             <m:rPr>
@@ -2808,13 +2818,7 @@
                 <w:rPr>
                   <w:rFonts w:ascii="Cambria Math" w:hAnsi="Cambria Math" w:cs="Times New Roman"/>
                 </w:rPr>
-                <m:t>HE,</m:t>
-              </m:r>
-              <m:r>
-                <w:rPr>
-                  <w:rFonts w:ascii="Cambria Math" w:hAnsi="Cambria Math" w:cs="Times New Roman"/>
-                </w:rPr>
-                <m:t>fl</m:t>
+                <m:t>HE,fl</m:t>
               </m:r>
             </m:sub>
           </m:sSub>
@@ -2846,19 +2850,7 @@
                 <w:rPr>
                   <w:rFonts w:ascii="Cambria Math" w:hAnsi="Cambria Math" w:cs="Times New Roman"/>
                 </w:rPr>
-                <m:t>ref,</m:t>
-              </m:r>
-              <m:r>
-                <w:rPr>
-                  <w:rFonts w:ascii="Cambria Math" w:hAnsi="Cambria Math" w:cs="Times New Roman"/>
-                </w:rPr>
-                <m:t>f</m:t>
-              </m:r>
-              <m:r>
-                <w:rPr>
-                  <w:rFonts w:ascii="Cambria Math" w:hAnsi="Cambria Math" w:cs="Times New Roman"/>
-                </w:rPr>
-                <m:t>l</m:t>
+                <m:t>ref,fl</m:t>
               </m:r>
             </m:sub>
           </m:sSub>
@@ -3024,19 +3016,7 @@
                 <w:rPr>
                   <w:rFonts w:ascii="Cambria Math" w:eastAsiaTheme="minorEastAsia" w:hAnsi="Cambria Math" w:cs="Times New Roman"/>
                 </w:rPr>
-                <m:t>∆T</m:t>
-              </m:r>
-              <m:r>
-                <w:rPr>
-                  <w:rFonts w:ascii="Cambria Math" w:eastAsiaTheme="minorEastAsia" w:hAnsi="Cambria Math" w:cs="Times New Roman"/>
-                </w:rPr>
-                <m:t xml:space="preserve">+ </m:t>
-              </m:r>
-              <m:r>
-                <w:rPr>
-                  <w:rFonts w:ascii="Cambria Math" w:eastAsiaTheme="minorEastAsia" w:hAnsi="Cambria Math" w:cs="Times New Roman"/>
-                </w:rPr>
-                <m:t>∆</m:t>
+                <m:t>∆T+ ∆</m:t>
               </m:r>
               <m:sSub>
                 <m:sSubPr>
@@ -3250,19 +3230,7 @@
                 <w:rPr>
                   <w:rFonts w:ascii="Cambria Math" w:eastAsiaTheme="minorEastAsia" w:hAnsi="Cambria Math" w:cs="Times New Roman"/>
                 </w:rPr>
-                <m:t>∆T</m:t>
-              </m:r>
-              <m:r>
-                <w:rPr>
-                  <w:rFonts w:ascii="Cambria Math" w:eastAsiaTheme="minorEastAsia" w:hAnsi="Cambria Math" w:cs="Times New Roman"/>
-                </w:rPr>
-                <m:t xml:space="preserve">+ </m:t>
-              </m:r>
-              <m:r>
-                <w:rPr>
-                  <w:rFonts w:ascii="Cambria Math" w:eastAsiaTheme="minorEastAsia" w:hAnsi="Cambria Math" w:cs="Times New Roman"/>
-                </w:rPr>
-                <m:t>∆</m:t>
+                <m:t>∆T+ ∆</m:t>
               </m:r>
               <m:sSub>
                 <m:sSubPr>
@@ -3660,40 +3628,6 @@
     </w:p>
     <w:p>
       <w:pPr>
-        <w:jc w:val="both"/>
-        <w:rPr>
-          <w:rFonts w:ascii="Cambria" w:eastAsiaTheme="minorEastAsia" w:hAnsi="Cambria" w:cs="Times New Roman"/>
-        </w:rPr>
-      </w:pPr>
-    </w:p>
-    <w:p>
-      <w:pPr>
-        <w:jc w:val="both"/>
-        <w:rPr>
-          <w:rFonts w:ascii="Cambria" w:eastAsiaTheme="minorEastAsia" w:hAnsi="Cambria" w:cs="Times New Roman"/>
-        </w:rPr>
-      </w:pPr>
-      <w:r>
-        <w:rPr>
-          <w:rFonts w:ascii="Cambria" w:eastAsiaTheme="minorEastAsia" w:hAnsi="Cambria" w:cs="Times New Roman"/>
-        </w:rPr>
-        <w:t>The model is</w:t>
-      </w:r>
-      <w:r>
-        <w:rPr>
-          <w:rFonts w:ascii="Cambria" w:eastAsiaTheme="minorEastAsia" w:hAnsi="Cambria" w:cs="Times New Roman"/>
-        </w:rPr>
-        <w:t xml:space="preserve"> tested on 10 different installations with different power/ number of points per application </w:t>
-      </w:r>
-      <w:r>
-        <w:rPr>
-          <w:rFonts w:ascii="Cambria" w:eastAsiaTheme="minorEastAsia" w:hAnsi="Cambria" w:cs="Times New Roman"/>
-        </w:rPr>
-        <w:t>and type of secondary fluid (two geothermal HPs).</w:t>
-      </w:r>
-    </w:p>
-    <w:p>
-      <w:pPr>
         <w:rPr>
           <w:rFonts w:ascii="Cambria" w:hAnsi="Cambria" w:cs="Times New Roman"/>
           <w:b/>
@@ -3702,7 +3636,9 @@
           <w:szCs w:val="24"/>
         </w:rPr>
       </w:pPr>
-      <w:r>
+    </w:p>
+    <w:p>
+      <w:pPr>
         <w:rPr>
           <w:rFonts w:ascii="Cambria" w:hAnsi="Cambria" w:cs="Times New Roman"/>
           <w:b/>
@@ -3710,7 +3646,143 @@
           <w:sz w:val="24"/>
           <w:szCs w:val="24"/>
         </w:rPr>
+      </w:pPr>
+    </w:p>
+    <w:p>
+      <w:pPr>
+        <w:rPr>
+          <w:rFonts w:ascii="Cambria" w:hAnsi="Cambria" w:cs="Times New Roman"/>
+          <w:b/>
+          <w:bCs/>
+          <w:sz w:val="24"/>
+          <w:szCs w:val="24"/>
+        </w:rPr>
+      </w:pPr>
+    </w:p>
+    <w:p>
+      <w:pPr>
+        <w:rPr>
+          <w:rFonts w:ascii="Cambria" w:hAnsi="Cambria" w:cs="Times New Roman"/>
+          <w:b/>
+          <w:bCs/>
+          <w:sz w:val="24"/>
+          <w:szCs w:val="24"/>
+        </w:rPr>
+      </w:pPr>
+      <w:r>
+        <w:rPr>
+          <w:rFonts w:ascii="Cambria" w:hAnsi="Cambria" w:cs="Times New Roman"/>
+          <w:b/>
+          <w:bCs/>
+          <w:sz w:val="24"/>
+          <w:szCs w:val="24"/>
+        </w:rPr>
         <w:lastRenderedPageBreak/>
+        <w:t>Model for Power in partial load</w:t>
+      </w:r>
+    </w:p>
+    <w:p>
+      <w:pPr>
+        <w:jc w:val="both"/>
+        <w:rPr>
+          <w:rFonts w:ascii="Cambria" w:eastAsiaTheme="minorEastAsia" w:hAnsi="Cambria" w:cs="Times New Roman"/>
+        </w:rPr>
+      </w:pPr>
+      <w:r>
+        <w:rPr>
+          <w:rFonts w:ascii="Cambria" w:eastAsiaTheme="minorEastAsia" w:hAnsi="Cambria" w:cs="Times New Roman"/>
+        </w:rPr>
+        <w:t>The model is</w:t>
+      </w:r>
+      <w:r>
+        <w:rPr>
+          <w:rFonts w:ascii="Cambria" w:eastAsiaTheme="minorEastAsia" w:hAnsi="Cambria" w:cs="Times New Roman"/>
+        </w:rPr>
+        <w:t xml:space="preserve"> tested on 10 different installations with different power/ number of points per application </w:t>
+      </w:r>
+      <w:r>
+        <w:rPr>
+          <w:rFonts w:ascii="Cambria" w:eastAsiaTheme="minorEastAsia" w:hAnsi="Cambria" w:cs="Times New Roman"/>
+        </w:rPr>
+        <w:t>and type of secondary fluid (two geothermal HPs).</w:t>
+      </w:r>
+      <w:r>
+        <w:rPr>
+          <w:rFonts w:ascii="Cambria" w:eastAsiaTheme="minorEastAsia" w:hAnsi="Cambria" w:cs="Times New Roman"/>
+        </w:rPr>
+        <w:t xml:space="preserve"> </w:t>
+      </w:r>
+      <w:r>
+        <w:rPr>
+          <w:rFonts w:ascii="Cambria" w:eastAsiaTheme="minorEastAsia" w:hAnsi="Cambria" w:cs="Times New Roman"/>
+        </w:rPr>
+        <w:t xml:space="preserve">In the first phase, the models where selected considering just the </w:t>
+      </w:r>
+      <w:r>
+        <w:rPr>
+          <w:rFonts w:ascii="Cambria" w:eastAsiaTheme="minorEastAsia" w:hAnsi="Cambria" w:cs="Times New Roman"/>
+        </w:rPr>
+        <w:t xml:space="preserve">catalogue for training, whereas in the second phase, the models where trained using a machine learning algorithm </w:t>
+      </w:r>
+      <w:proofErr w:type="gramStart"/>
+      <w:r>
+        <w:rPr>
+          <w:rFonts w:ascii="Cambria" w:eastAsiaTheme="minorEastAsia" w:hAnsi="Cambria" w:cs="Times New Roman"/>
+        </w:rPr>
+        <w:t>in order to</w:t>
+      </w:r>
+      <w:proofErr w:type="gramEnd"/>
+      <w:r>
+        <w:rPr>
+          <w:rFonts w:ascii="Cambria" w:eastAsiaTheme="minorEastAsia" w:hAnsi="Cambria" w:cs="Times New Roman"/>
+        </w:rPr>
+        <w:t xml:space="preserve"> </w:t>
+      </w:r>
+      <w:r>
+        <w:rPr>
+          <w:rFonts w:ascii="Cambria" w:eastAsiaTheme="minorEastAsia" w:hAnsi="Cambria" w:cs="Times New Roman"/>
+        </w:rPr>
+        <w:t>verify the difference between the two approaches.</w:t>
+      </w:r>
+      <w:r>
+        <w:rPr>
+          <w:rFonts w:ascii="Cambria" w:eastAsiaTheme="minorEastAsia" w:hAnsi="Cambria" w:cs="Times New Roman"/>
+        </w:rPr>
+        <w:t xml:space="preserve"> </w:t>
+      </w:r>
+      <w:proofErr w:type="gramStart"/>
+      <w:r>
+        <w:rPr>
+          <w:rFonts w:ascii="Cambria" w:eastAsiaTheme="minorEastAsia" w:hAnsi="Cambria" w:cs="Times New Roman"/>
+        </w:rPr>
+        <w:t>In particular, in</w:t>
+      </w:r>
+      <w:proofErr w:type="gramEnd"/>
+      <w:r>
+        <w:rPr>
+          <w:rFonts w:ascii="Cambria" w:eastAsiaTheme="minorEastAsia" w:hAnsi="Cambria" w:cs="Times New Roman"/>
+        </w:rPr>
+        <w:t xml:space="preserve"> the second step, the dataset is divided into 80% for training and 20% for testing.</w:t>
+      </w:r>
+    </w:p>
+    <w:p>
+      <w:pPr>
+        <w:rPr>
+          <w:rFonts w:ascii="Cambria" w:hAnsi="Cambria" w:cs="Times New Roman"/>
+          <w:b/>
+          <w:bCs/>
+          <w:sz w:val="24"/>
+          <w:szCs w:val="24"/>
+        </w:rPr>
+      </w:pPr>
+      <w:r>
+        <w:rPr>
+          <w:rFonts w:ascii="Cambria" w:hAnsi="Cambria" w:cs="Times New Roman"/>
+          <w:b/>
+          <w:bCs/>
+          <w:sz w:val="24"/>
+          <w:szCs w:val="24"/>
+        </w:rPr>
         <w:t>Results</w:t>
       </w:r>
     </w:p>
@@ -3734,10 +3806,10 @@
           <w:szCs w:val="24"/>
         </w:rPr>
         <w:drawing>
-          <wp:inline distT="0" distB="0" distL="0" distR="0" wp14:anchorId="4B02E2FF" wp14:editId="6133E889">
+          <wp:inline distT="0" distB="0" distL="0" distR="0" wp14:anchorId="2355BDF9" wp14:editId="43FCF39F">
             <wp:extent cx="6120130" cy="3060065"/>
             <wp:effectExtent l="0" t="0" r="0" b="6985"/>
-            <wp:docPr id="1856676400" name="Immagine 1"/>
+            <wp:docPr id="44513638" name="Immagine 1"/>
             <wp:cNvGraphicFramePr>
               <a:graphicFrameLocks xmlns:a="http://schemas.openxmlformats.org/drawingml/2006/main" noChangeAspect="1"/>
             </wp:cNvGraphicFramePr>
@@ -3745,7 +3817,522 @@
               <a:graphicData uri="http://schemas.openxmlformats.org/drawingml/2006/picture">
                 <pic:pic xmlns:pic="http://schemas.openxmlformats.org/drawingml/2006/picture">
                   <pic:nvPicPr>
-                    <pic:cNvPr id="1856676400" name="Immagine 1"/>
+                    <pic:cNvPr id="44513638" name="Immagine 44513638"/>
+                    <pic:cNvPicPr/>
+                  </pic:nvPicPr>
+                  <pic:blipFill>
+                    <a:blip r:embed="rId7" cstate="print">
+                      <a:extLst>
+                        <a:ext uri="{28A0092B-C50C-407E-A947-70E740481C1C}">
+                          <a14:useLocalDpi xmlns:a14="http://schemas.microsoft.com/office/drawing/2010/main" val="0"/>
+                        </a:ext>
+                      </a:extLst>
+                    </a:blip>
+                    <a:stretch>
+                      <a:fillRect/>
+                    </a:stretch>
+                  </pic:blipFill>
+                  <pic:spPr>
+                    <a:xfrm>
+                      <a:off x="0" y="0"/>
+                      <a:ext cx="6120130" cy="3060065"/>
+                    </a:xfrm>
+                    <a:prstGeom prst="rect">
+                      <a:avLst/>
+                    </a:prstGeom>
+                  </pic:spPr>
+                </pic:pic>
+              </a:graphicData>
+            </a:graphic>
+          </wp:inline>
+        </w:drawing>
+      </w:r>
+    </w:p>
+    <w:p>
+      <w:pPr>
+        <w:rPr>
+          <w:rFonts w:ascii="Cambria" w:hAnsi="Cambria" w:cs="Times New Roman"/>
+          <w:b/>
+          <w:bCs/>
+          <w:sz w:val="24"/>
+          <w:szCs w:val="24"/>
+        </w:rPr>
+      </w:pPr>
+      <w:r>
+        <w:rPr>
+          <w:rFonts w:ascii="Cambria" w:hAnsi="Cambria" w:cs="Times New Roman"/>
+          <w:b/>
+          <w:bCs/>
+          <w:noProof/>
+          <w:sz w:val="24"/>
+          <w:szCs w:val="24"/>
+        </w:rPr>
+        <w:drawing>
+          <wp:inline distT="0" distB="0" distL="0" distR="0" wp14:anchorId="33D7C165" wp14:editId="289DACDA">
+            <wp:extent cx="6120130" cy="3060065"/>
+            <wp:effectExtent l="0" t="0" r="0" b="6985"/>
+            <wp:docPr id="238216582" name="Immagine 2" descr="Immagine che contiene schermata, linea, Diagramma, testo&#10;&#10;Il contenuto generato dall'IA potrebbe non essere corretto."/>
+            <wp:cNvGraphicFramePr>
+              <a:graphicFrameLocks xmlns:a="http://schemas.openxmlformats.org/drawingml/2006/main" noChangeAspect="1"/>
+            </wp:cNvGraphicFramePr>
+            <a:graphic xmlns:a="http://schemas.openxmlformats.org/drawingml/2006/main">
+              <a:graphicData uri="http://schemas.openxmlformats.org/drawingml/2006/picture">
+                <pic:pic xmlns:pic="http://schemas.openxmlformats.org/drawingml/2006/picture">
+                  <pic:nvPicPr>
+                    <pic:cNvPr id="238216582" name="Immagine 2" descr="Immagine che contiene schermata, linea, Diagramma, testo&#10;&#10;Il contenuto generato dall'IA potrebbe non essere corretto."/>
+                    <pic:cNvPicPr/>
+                  </pic:nvPicPr>
+                  <pic:blipFill>
+                    <a:blip r:embed="rId8" cstate="print">
+                      <a:extLst>
+                        <a:ext uri="{28A0092B-C50C-407E-A947-70E740481C1C}">
+                          <a14:useLocalDpi xmlns:a14="http://schemas.microsoft.com/office/drawing/2010/main" val="0"/>
+                        </a:ext>
+                      </a:extLst>
+                    </a:blip>
+                    <a:stretch>
+                      <a:fillRect/>
+                    </a:stretch>
+                  </pic:blipFill>
+                  <pic:spPr>
+                    <a:xfrm>
+                      <a:off x="0" y="0"/>
+                      <a:ext cx="6120130" cy="3060065"/>
+                    </a:xfrm>
+                    <a:prstGeom prst="rect">
+                      <a:avLst/>
+                    </a:prstGeom>
+                  </pic:spPr>
+                </pic:pic>
+              </a:graphicData>
+            </a:graphic>
+          </wp:inline>
+        </w:drawing>
+      </w:r>
+    </w:p>
+    <w:p>
+      <w:pPr>
+        <w:rPr>
+          <w:rFonts w:ascii="Cambria" w:hAnsi="Cambria" w:cs="Times New Roman"/>
+          <w:sz w:val="24"/>
+          <w:szCs w:val="24"/>
+        </w:rPr>
+      </w:pPr>
+    </w:p>
+    <w:p>
+      <w:pPr>
+        <w:jc w:val="both"/>
+        <w:rPr>
+          <w:rFonts w:ascii="Cambria" w:eastAsiaTheme="minorEastAsia" w:hAnsi="Cambria" w:cs="Times New Roman"/>
+        </w:rPr>
+      </w:pPr>
+      <w:r>
+        <w:rPr>
+          <w:rFonts w:ascii="Cambria" w:eastAsiaTheme="minorEastAsia" w:hAnsi="Cambria" w:cs="Times New Roman"/>
+        </w:rPr>
+        <w:t>The main results are showed down here:</w:t>
+      </w:r>
+    </w:p>
+    <w:p>
+      <w:pPr>
+        <w:pStyle w:val="Paragrafoelenco"/>
+        <w:numPr>
+          <w:ilvl w:val="0"/>
+          <w:numId w:val="5"/>
+        </w:numPr>
+        <w:jc w:val="both"/>
+        <w:rPr>
+          <w:rFonts w:ascii="Cambria" w:eastAsiaTheme="minorEastAsia" w:hAnsi="Cambria" w:cs="Times New Roman"/>
+        </w:rPr>
+      </w:pPr>
+      <w:r>
+        <w:rPr>
+          <w:rFonts w:ascii="Cambria" w:eastAsiaTheme="minorEastAsia" w:hAnsi="Cambria" w:cs="Times New Roman"/>
+        </w:rPr>
+        <w:t xml:space="preserve">R2 is generally good for all the installations/ machines with few </w:t>
+      </w:r>
+      <w:proofErr w:type="spellStart"/>
+      <w:r>
+        <w:rPr>
+          <w:rFonts w:ascii="Cambria" w:eastAsiaTheme="minorEastAsia" w:hAnsi="Cambria" w:cs="Times New Roman"/>
+        </w:rPr>
+        <w:t>exeptions</w:t>
+      </w:r>
+      <w:proofErr w:type="spellEnd"/>
+      <w:r>
+        <w:rPr>
+          <w:rFonts w:ascii="Cambria" w:eastAsiaTheme="minorEastAsia" w:hAnsi="Cambria" w:cs="Times New Roman"/>
+        </w:rPr>
+        <w:t xml:space="preserve">. </w:t>
+      </w:r>
+      <w:r>
+        <w:rPr>
+          <w:rFonts w:ascii="Cambria" w:eastAsiaTheme="minorEastAsia" w:hAnsi="Cambria" w:cs="Times New Roman"/>
+        </w:rPr>
+        <w:t xml:space="preserve">It is around 0.5 with the operation for the unit NF2040. </w:t>
+      </w:r>
+      <w:r>
+        <w:rPr>
+          <w:rFonts w:ascii="Cambria" w:eastAsiaTheme="minorEastAsia" w:hAnsi="Cambria" w:cs="Times New Roman"/>
+        </w:rPr>
+        <w:t xml:space="preserve">The catalogue of this unit present partial load points just in the conditions </w:t>
+      </w:r>
+      <w:r>
+        <w:rPr>
+          <w:rFonts w:ascii="Cambria" w:eastAsiaTheme="minorEastAsia" w:hAnsi="Cambria" w:cs="Times New Roman"/>
+        </w:rPr>
+        <w:t xml:space="preserve">with LExT = 55°c which is generally too high for a real application scenario. Thus, </w:t>
+      </w:r>
+      <w:r>
+        <w:rPr>
+          <w:rFonts w:ascii="Cambria" w:eastAsiaTheme="minorEastAsia" w:hAnsi="Cambria" w:cs="Times New Roman"/>
+        </w:rPr>
+        <w:lastRenderedPageBreak/>
+        <w:t xml:space="preserve">the model tends to fail in the predictions of the </w:t>
+      </w:r>
+      <w:r>
+        <w:rPr>
+          <w:rFonts w:ascii="Cambria" w:eastAsiaTheme="minorEastAsia" w:hAnsi="Cambria" w:cs="Times New Roman"/>
+        </w:rPr>
+        <w:t xml:space="preserve">SCOP and of the power. In this case, MAPE is above </w:t>
+      </w:r>
+      <w:proofErr w:type="gramStart"/>
+      <w:r>
+        <w:rPr>
+          <w:rFonts w:ascii="Cambria" w:eastAsiaTheme="minorEastAsia" w:hAnsi="Cambria" w:cs="Times New Roman"/>
+        </w:rPr>
+        <w:t>20%;</w:t>
+      </w:r>
+      <w:proofErr w:type="gramEnd"/>
+    </w:p>
+    <w:p>
+      <w:pPr>
+        <w:pStyle w:val="Paragrafoelenco"/>
+        <w:numPr>
+          <w:ilvl w:val="0"/>
+          <w:numId w:val="5"/>
+        </w:numPr>
+        <w:jc w:val="both"/>
+        <w:rPr>
+          <w:rFonts w:ascii="Cambria" w:eastAsiaTheme="minorEastAsia" w:hAnsi="Cambria" w:cs="Times New Roman"/>
+        </w:rPr>
+      </w:pPr>
+      <w:r>
+        <w:rPr>
+          <w:rFonts w:ascii="Cambria" w:eastAsiaTheme="minorEastAsia" w:hAnsi="Cambria" w:cs="Times New Roman"/>
+        </w:rPr>
+        <w:t xml:space="preserve">In all almost all models, the </w:t>
+      </w:r>
+      <w:r>
+        <w:rPr>
+          <w:rFonts w:ascii="Cambria" w:eastAsiaTheme="minorEastAsia" w:hAnsi="Cambria" w:cs="Times New Roman"/>
+        </w:rPr>
+        <w:t xml:space="preserve">predictions are better in the stationary regime compared to the functioning </w:t>
+      </w:r>
+      <w:r>
+        <w:rPr>
+          <w:rFonts w:ascii="Cambria" w:eastAsiaTheme="minorEastAsia" w:hAnsi="Cambria" w:cs="Times New Roman"/>
+        </w:rPr>
+        <w:t xml:space="preserve">considering even defrost, DHW, acceleration and deceleration </w:t>
+      </w:r>
+      <w:r>
+        <w:rPr>
+          <w:rFonts w:ascii="Cambria" w:eastAsiaTheme="minorEastAsia" w:hAnsi="Cambria" w:cs="Times New Roman"/>
+        </w:rPr>
+        <w:t>are always better. The model is more precise when predicts the stationary conditions.</w:t>
+      </w:r>
+    </w:p>
+    <w:p>
+      <w:pPr>
+        <w:pStyle w:val="Paragrafoelenco"/>
+        <w:numPr>
+          <w:ilvl w:val="0"/>
+          <w:numId w:val="5"/>
+        </w:numPr>
+        <w:jc w:val="both"/>
+        <w:rPr>
+          <w:rFonts w:ascii="Cambria" w:eastAsiaTheme="minorEastAsia" w:hAnsi="Cambria" w:cs="Times New Roman"/>
+        </w:rPr>
+      </w:pPr>
+      <w:r>
+        <w:rPr>
+          <w:rFonts w:ascii="Cambria" w:eastAsiaTheme="minorEastAsia" w:hAnsi="Cambria" w:cs="Times New Roman"/>
+        </w:rPr>
+        <w:t xml:space="preserve">The SCOP is higher in the stationary </w:t>
+      </w:r>
+      <w:r>
+        <w:rPr>
+          <w:rFonts w:ascii="Cambria" w:eastAsiaTheme="minorEastAsia" w:hAnsi="Cambria" w:cs="Times New Roman"/>
+        </w:rPr>
+        <w:t xml:space="preserve">regime </w:t>
+      </w:r>
+      <w:proofErr w:type="gramStart"/>
+      <w:r>
+        <w:rPr>
+          <w:rFonts w:ascii="Cambria" w:eastAsiaTheme="minorEastAsia" w:hAnsi="Cambria" w:cs="Times New Roman"/>
+        </w:rPr>
+        <w:t>compare</w:t>
+      </w:r>
+      <w:proofErr w:type="gramEnd"/>
+      <w:r>
+        <w:rPr>
+          <w:rFonts w:ascii="Cambria" w:eastAsiaTheme="minorEastAsia" w:hAnsi="Cambria" w:cs="Times New Roman"/>
+        </w:rPr>
+        <w:t xml:space="preserve"> to the other. The SCOP of the geothermal HP is </w:t>
+      </w:r>
+      <w:r>
+        <w:rPr>
+          <w:rFonts w:ascii="Cambria" w:eastAsiaTheme="minorEastAsia" w:hAnsi="Cambria" w:cs="Times New Roman"/>
+        </w:rPr>
+        <w:t xml:space="preserve">the highest </w:t>
+      </w:r>
+      <w:proofErr w:type="gramStart"/>
+      <w:r>
+        <w:rPr>
+          <w:rFonts w:ascii="Cambria" w:eastAsiaTheme="minorEastAsia" w:hAnsi="Cambria" w:cs="Times New Roman"/>
+        </w:rPr>
+        <w:t>compare</w:t>
+      </w:r>
+      <w:proofErr w:type="gramEnd"/>
+      <w:r>
+        <w:rPr>
+          <w:rFonts w:ascii="Cambria" w:eastAsiaTheme="minorEastAsia" w:hAnsi="Cambria" w:cs="Times New Roman"/>
+        </w:rPr>
+        <w:t xml:space="preserve"> to the installation ID 2050. In case of geothermal HPs, the source </w:t>
+      </w:r>
+      <w:r>
+        <w:rPr>
+          <w:rFonts w:ascii="Cambria" w:eastAsiaTheme="minorEastAsia" w:hAnsi="Cambria" w:cs="Times New Roman"/>
+        </w:rPr>
+        <w:t xml:space="preserve">temperature is not related to the outdoor temperature, but to the temperature of the </w:t>
+      </w:r>
+      <w:r>
+        <w:rPr>
+          <w:rFonts w:ascii="Cambria" w:eastAsiaTheme="minorEastAsia" w:hAnsi="Cambria" w:cs="Times New Roman"/>
+        </w:rPr>
+        <w:t>water – glycol mixture flowing through the evaporator.</w:t>
+      </w:r>
+    </w:p>
+    <w:p>
+      <w:pPr>
+        <w:pStyle w:val="Paragrafoelenco"/>
+        <w:numPr>
+          <w:ilvl w:val="0"/>
+          <w:numId w:val="5"/>
+        </w:numPr>
+        <w:jc w:val="both"/>
+        <w:rPr>
+          <w:rFonts w:ascii="Cambria" w:eastAsiaTheme="minorEastAsia" w:hAnsi="Cambria" w:cs="Times New Roman"/>
+        </w:rPr>
+      </w:pPr>
+      <w:r>
+        <w:rPr>
+          <w:rFonts w:ascii="Cambria" w:eastAsiaTheme="minorEastAsia" w:hAnsi="Cambria" w:cs="Times New Roman"/>
+        </w:rPr>
+        <w:t xml:space="preserve">The models which </w:t>
+      </w:r>
+      <w:proofErr w:type="gramStart"/>
+      <w:r>
+        <w:rPr>
+          <w:rFonts w:ascii="Cambria" w:eastAsiaTheme="minorEastAsia" w:hAnsi="Cambria" w:cs="Times New Roman"/>
+        </w:rPr>
+        <w:t>fails</w:t>
+      </w:r>
+      <w:proofErr w:type="gramEnd"/>
+      <w:r>
+        <w:rPr>
+          <w:rFonts w:ascii="Cambria" w:eastAsiaTheme="minorEastAsia" w:hAnsi="Cambria" w:cs="Times New Roman"/>
+        </w:rPr>
+        <w:t xml:space="preserve"> the most in the prediction of the SCOP are the ones which have a l</w:t>
+      </w:r>
+      <w:r>
+        <w:rPr>
+          <w:rFonts w:ascii="Cambria" w:eastAsiaTheme="minorEastAsia" w:hAnsi="Cambria" w:cs="Times New Roman"/>
+        </w:rPr>
+        <w:t xml:space="preserve">ower </w:t>
+      </w:r>
+      <w:proofErr w:type="gramStart"/>
+      <w:r>
+        <w:rPr>
+          <w:rFonts w:ascii="Cambria" w:eastAsiaTheme="minorEastAsia" w:hAnsi="Cambria" w:cs="Times New Roman"/>
+        </w:rPr>
+        <w:t>amount</w:t>
+      </w:r>
+      <w:proofErr w:type="gramEnd"/>
+      <w:r>
+        <w:rPr>
+          <w:rFonts w:ascii="Cambria" w:eastAsiaTheme="minorEastAsia" w:hAnsi="Cambria" w:cs="Times New Roman"/>
+        </w:rPr>
+        <w:t xml:space="preserve"> of points in partial load operation.</w:t>
+      </w:r>
+    </w:p>
+    <w:p>
+      <w:pPr>
+        <w:pStyle w:val="Paragrafoelenco"/>
+        <w:numPr>
+          <w:ilvl w:val="0"/>
+          <w:numId w:val="5"/>
+        </w:numPr>
+        <w:jc w:val="both"/>
+        <w:rPr>
+          <w:rFonts w:ascii="Cambria" w:eastAsiaTheme="minorEastAsia" w:hAnsi="Cambria" w:cs="Times New Roman"/>
+        </w:rPr>
+      </w:pPr>
+      <w:proofErr w:type="gramStart"/>
+      <w:r>
+        <w:rPr>
+          <w:rFonts w:ascii="Cambria" w:eastAsiaTheme="minorEastAsia" w:hAnsi="Cambria" w:cs="Times New Roman"/>
+        </w:rPr>
+        <w:t>In order to</w:t>
+      </w:r>
+      <w:proofErr w:type="gramEnd"/>
+      <w:r>
+        <w:rPr>
+          <w:rFonts w:ascii="Cambria" w:eastAsiaTheme="minorEastAsia" w:hAnsi="Cambria" w:cs="Times New Roman"/>
+        </w:rPr>
+        <w:t xml:space="preserve"> work, the model requires </w:t>
+      </w:r>
+      <w:r>
+        <w:rPr>
+          <w:rFonts w:ascii="Cambria" w:eastAsiaTheme="minorEastAsia" w:hAnsi="Cambria" w:cs="Times New Roman"/>
+        </w:rPr>
+        <w:t xml:space="preserve">at least 4 – 5 points in partial load and the corresponding points in full load (a total amount of 8 points). The points should be taken with </w:t>
+      </w:r>
+      <w:r>
+        <w:rPr>
+          <w:rFonts w:ascii="Cambria" w:eastAsiaTheme="minorEastAsia" w:hAnsi="Cambria" w:cs="Times New Roman"/>
+        </w:rPr>
+        <w:t xml:space="preserve">different combinations of SET and LExT </w:t>
+      </w:r>
+      <w:proofErr w:type="gramStart"/>
+      <w:r>
+        <w:rPr>
+          <w:rFonts w:ascii="Cambria" w:eastAsiaTheme="minorEastAsia" w:hAnsi="Cambria" w:cs="Times New Roman"/>
+        </w:rPr>
+        <w:t>in order to</w:t>
+      </w:r>
+      <w:proofErr w:type="gramEnd"/>
+      <w:r>
+        <w:rPr>
+          <w:rFonts w:ascii="Cambria" w:eastAsiaTheme="minorEastAsia" w:hAnsi="Cambria" w:cs="Times New Roman"/>
+        </w:rPr>
+        <w:t xml:space="preserve"> cover a good part of the envelope. </w:t>
+      </w:r>
+    </w:p>
+    <w:p>
+      <w:pPr>
+        <w:pStyle w:val="Paragrafoelenco"/>
+        <w:numPr>
+          <w:ilvl w:val="0"/>
+          <w:numId w:val="5"/>
+        </w:numPr>
+        <w:jc w:val="both"/>
+        <w:rPr>
+          <w:rFonts w:ascii="Cambria" w:eastAsiaTheme="minorEastAsia" w:hAnsi="Cambria" w:cs="Times New Roman"/>
+        </w:rPr>
+      </w:pPr>
+      <w:r>
+        <w:rPr>
+          <w:rFonts w:ascii="Cambria" w:eastAsiaTheme="minorEastAsia" w:hAnsi="Cambria" w:cs="Times New Roman"/>
+        </w:rPr>
+        <w:t>The transitory regime</w:t>
+      </w:r>
+      <w:r>
+        <w:rPr>
+          <w:rFonts w:ascii="Cambria" w:eastAsiaTheme="minorEastAsia" w:hAnsi="Cambria" w:cs="Times New Roman"/>
+        </w:rPr>
+        <w:t xml:space="preserve"> </w:t>
+      </w:r>
+      <w:proofErr w:type="gramStart"/>
+      <w:r>
+        <w:rPr>
+          <w:rFonts w:ascii="Cambria" w:eastAsiaTheme="minorEastAsia" w:hAnsi="Cambria" w:cs="Times New Roman"/>
+        </w:rPr>
+        <w:t>have</w:t>
+      </w:r>
+      <w:proofErr w:type="gramEnd"/>
+      <w:r>
+        <w:rPr>
+          <w:rFonts w:ascii="Cambria" w:eastAsiaTheme="minorEastAsia" w:hAnsi="Cambria" w:cs="Times New Roman"/>
+        </w:rPr>
+        <w:t xml:space="preserve"> an effect on the SCOP, decreasing the performance of the unit all over the periods analysed. </w:t>
+      </w:r>
+      <w:r>
+        <w:rPr>
+          <w:rFonts w:ascii="Cambria" w:eastAsiaTheme="minorEastAsia" w:hAnsi="Cambria" w:cs="Times New Roman"/>
+        </w:rPr>
+        <w:t xml:space="preserve"> </w:t>
+      </w:r>
+      <w:r>
+        <w:rPr>
+          <w:rFonts w:ascii="Cambria" w:eastAsiaTheme="minorEastAsia" w:hAnsi="Cambria" w:cs="Times New Roman"/>
+        </w:rPr>
+        <w:t>To predict the coefficient of performance of the unit in partial load operation during the transitory regimes, it would be necessary to analyse that specific states.</w:t>
+      </w:r>
+    </w:p>
+    <w:p>
+      <w:pPr>
+        <w:jc w:val="both"/>
+        <w:rPr>
+          <w:rFonts w:ascii="Cambria" w:eastAsiaTheme="minorEastAsia" w:hAnsi="Cambria" w:cs="Times New Roman"/>
+        </w:rPr>
+      </w:pPr>
+      <w:r>
+        <w:rPr>
+          <w:rFonts w:ascii="Cambria" w:eastAsiaTheme="minorEastAsia" w:hAnsi="Cambria" w:cs="Times New Roman"/>
+        </w:rPr>
+        <w:t>In th</w:t>
+      </w:r>
+      <w:r>
+        <w:rPr>
+          <w:rFonts w:ascii="Cambria" w:eastAsiaTheme="minorEastAsia" w:hAnsi="Cambria" w:cs="Times New Roman"/>
+        </w:rPr>
+        <w:t xml:space="preserve">e Figure </w:t>
+      </w:r>
+      <w:r>
+        <w:rPr>
+          <w:rFonts w:ascii="Cambria" w:eastAsiaTheme="minorEastAsia" w:hAnsi="Cambria" w:cs="Times New Roman"/>
+        </w:rPr>
+        <w:t>XX</w:t>
+      </w:r>
+      <w:r>
+        <w:rPr>
+          <w:rFonts w:ascii="Cambria" w:eastAsiaTheme="minorEastAsia" w:hAnsi="Cambria" w:cs="Times New Roman"/>
+        </w:rPr>
+        <w:t xml:space="preserve">, the model was trained using 80% of the experimental dataset and then tested on the </w:t>
+      </w:r>
+      <w:r>
+        <w:rPr>
+          <w:rFonts w:ascii="Cambria" w:eastAsiaTheme="minorEastAsia" w:hAnsi="Cambria" w:cs="Times New Roman"/>
+        </w:rPr>
+        <w:t xml:space="preserve">remaining part. </w:t>
+      </w:r>
+    </w:p>
+    <w:p>
+      <w:pPr>
+        <w:jc w:val="both"/>
+        <w:rPr>
+          <w:rFonts w:ascii="Cambria" w:eastAsiaTheme="minorEastAsia" w:hAnsi="Cambria" w:cs="Times New Roman"/>
+        </w:rPr>
+      </w:pPr>
+      <w:r>
+        <w:rPr>
+          <w:rFonts w:ascii="Cambria" w:eastAsiaTheme="minorEastAsia" w:hAnsi="Cambria" w:cs="Times New Roman"/>
+          <w:noProof/>
+        </w:rPr>
+        <w:drawing>
+          <wp:inline distT="0" distB="0" distL="0" distR="0" wp14:anchorId="7BB3064B" wp14:editId="52EEA786">
+            <wp:extent cx="6120130" cy="3060065"/>
+            <wp:effectExtent l="0" t="0" r="0" b="6985"/>
+            <wp:docPr id="331792429" name="Immagine 4" descr="Immagine che contiene testo, schermata, linea, diagramma&#10;&#10;Il contenuto generato dall'IA potrebbe non essere corretto."/>
+            <wp:cNvGraphicFramePr>
+              <a:graphicFrameLocks xmlns:a="http://schemas.openxmlformats.org/drawingml/2006/main" noChangeAspect="1"/>
+            </wp:cNvGraphicFramePr>
+            <a:graphic xmlns:a="http://schemas.openxmlformats.org/drawingml/2006/main">
+              <a:graphicData uri="http://schemas.openxmlformats.org/drawingml/2006/picture">
+                <pic:pic xmlns:pic="http://schemas.openxmlformats.org/drawingml/2006/picture">
+                  <pic:nvPicPr>
+                    <pic:cNvPr id="331792429" name="Immagine 4" descr="Immagine che contiene testo, schermata, linea, diagramma&#10;&#10;Il contenuto generato dall'IA potrebbe non essere corretto."/>
                     <pic:cNvPicPr/>
                   </pic:nvPicPr>
                   <pic:blipFill>
@@ -3778,26 +4365,22 @@
     </w:p>
     <w:p>
       <w:pPr>
-        <w:rPr>
-          <w:rFonts w:ascii="Cambria" w:hAnsi="Cambria" w:cs="Times New Roman"/>
-          <w:sz w:val="24"/>
-          <w:szCs w:val="24"/>
-        </w:rPr>
-      </w:pPr>
-      <w:r>
-        <w:rPr>
-          <w:rFonts w:ascii="Cambria" w:hAnsi="Cambria" w:cs="Times New Roman"/>
-          <w:b/>
-          <w:bCs/>
+        <w:jc w:val="both"/>
+        <w:rPr>
+          <w:rFonts w:ascii="Cambria" w:eastAsiaTheme="minorEastAsia" w:hAnsi="Cambria" w:cs="Times New Roman"/>
+        </w:rPr>
+      </w:pPr>
+      <w:r>
+        <w:rPr>
+          <w:rFonts w:ascii="Cambria" w:eastAsiaTheme="minorEastAsia" w:hAnsi="Cambria" w:cs="Times New Roman"/>
           <w:noProof/>
-          <w:sz w:val="24"/>
-          <w:szCs w:val="24"/>
-        </w:rPr>
+        </w:rPr>
+        <w:lastRenderedPageBreak/>
         <w:drawing>
-          <wp:inline distT="0" distB="0" distL="0" distR="0" wp14:anchorId="1091142E" wp14:editId="7CAF03DB">
+          <wp:inline distT="0" distB="0" distL="0" distR="0" wp14:anchorId="6B3DFC06" wp14:editId="56995214">
             <wp:extent cx="6120130" cy="3060065"/>
             <wp:effectExtent l="0" t="0" r="0" b="6985"/>
-            <wp:docPr id="224679367" name="Immagine 2" descr="Immagine che contiene schermata, testo, linea, Parallelo&#10;&#10;Il contenuto generato dall'IA potrebbe non essere corretto."/>
+            <wp:docPr id="1318464793" name="Immagine 5" descr="Immagine che contiene schermata, testo, linea, Diagramma&#10;&#10;Il contenuto generato dall'IA potrebbe non essere corretto."/>
             <wp:cNvGraphicFramePr>
               <a:graphicFrameLocks xmlns:a="http://schemas.openxmlformats.org/drawingml/2006/main" noChangeAspect="1"/>
             </wp:cNvGraphicFramePr>
@@ -3805,7 +4388,7 @@
               <a:graphicData uri="http://schemas.openxmlformats.org/drawingml/2006/picture">
                 <pic:pic xmlns:pic="http://schemas.openxmlformats.org/drawingml/2006/picture">
                   <pic:nvPicPr>
-                    <pic:cNvPr id="224679367" name="Immagine 2" descr="Immagine che contiene schermata, testo, linea, Parallelo&#10;&#10;Il contenuto generato dall'IA potrebbe non essere corretto."/>
+                    <pic:cNvPr id="1318464793" name="Immagine 5" descr="Immagine che contiene schermata, testo, linea, Diagramma&#10;&#10;Il contenuto generato dall'IA potrebbe non essere corretto."/>
                     <pic:cNvPicPr/>
                   </pic:nvPicPr>
                   <pic:blipFill>
@@ -3847,7 +4430,13 @@
         <w:rPr>
           <w:rFonts w:ascii="Cambria" w:eastAsiaTheme="minorEastAsia" w:hAnsi="Cambria" w:cs="Times New Roman"/>
         </w:rPr>
-        <w:t>The main results are showed down here:</w:t>
+        <w:t xml:space="preserve">The main differences </w:t>
+      </w:r>
+      <w:r>
+        <w:rPr>
+          <w:rFonts w:ascii="Cambria" w:eastAsiaTheme="minorEastAsia" w:hAnsi="Cambria" w:cs="Times New Roman"/>
+        </w:rPr>
+        <w:t>are:</w:t>
       </w:r>
     </w:p>
     <w:p>
@@ -3855,7 +4444,7 @@
         <w:pStyle w:val="Paragrafoelenco"/>
         <w:numPr>
           <w:ilvl w:val="0"/>
-          <w:numId w:val="5"/>
+          <w:numId w:val="7"/>
         </w:numPr>
         <w:jc w:val="both"/>
         <w:rPr>
@@ -3866,31 +4455,43 @@
         <w:rPr>
           <w:rFonts w:ascii="Cambria" w:eastAsiaTheme="minorEastAsia" w:hAnsi="Cambria" w:cs="Times New Roman"/>
         </w:rPr>
-        <w:t xml:space="preserve">R2 is generally good for all the installations/ machines with few exeptions. </w:t>
-      </w:r>
-      <w:r>
-        <w:rPr>
-          <w:rFonts w:ascii="Cambria" w:eastAsiaTheme="minorEastAsia" w:hAnsi="Cambria" w:cs="Times New Roman"/>
-        </w:rPr>
-        <w:t xml:space="preserve">It is around 0.5 with the operation for the unit NF2040. </w:t>
-      </w:r>
-      <w:r>
-        <w:rPr>
-          <w:rFonts w:ascii="Cambria" w:eastAsiaTheme="minorEastAsia" w:hAnsi="Cambria" w:cs="Times New Roman"/>
-        </w:rPr>
-        <w:t xml:space="preserve">The catalogue of this unit present partial load points just in the conditions </w:t>
-      </w:r>
-      <w:r>
-        <w:rPr>
-          <w:rFonts w:ascii="Cambria" w:eastAsiaTheme="minorEastAsia" w:hAnsi="Cambria" w:cs="Times New Roman"/>
-        </w:rPr>
-        <w:t xml:space="preserve">with LExT = 55°c which is generally too high for a real application scenario. Thus, the model tends to fail in the predictions of the </w:t>
-      </w:r>
-      <w:r>
-        <w:rPr>
-          <w:rFonts w:ascii="Cambria" w:eastAsiaTheme="minorEastAsia" w:hAnsi="Cambria" w:cs="Times New Roman"/>
-        </w:rPr>
-        <w:t>SCOP and of the power. In this case, MAPE is above 20%;</w:t>
+        <w:t xml:space="preserve">In all the machines, the R2 is higher for </w:t>
+      </w:r>
+      <w:r>
+        <w:rPr>
+          <w:rFonts w:ascii="Cambria" w:eastAsiaTheme="minorEastAsia" w:hAnsi="Cambria" w:cs="Times New Roman"/>
+        </w:rPr>
+        <w:t xml:space="preserve">the models trained with machine learning, with a range between </w:t>
+      </w:r>
+      <w:r>
+        <w:rPr>
+          <w:rFonts w:ascii="Cambria" w:eastAsiaTheme="minorEastAsia" w:hAnsi="Cambria" w:cs="Times New Roman"/>
+        </w:rPr>
+        <w:t>0.78 an</w:t>
+      </w:r>
+      <w:r>
+        <w:rPr>
+          <w:rFonts w:ascii="Cambria" w:eastAsiaTheme="minorEastAsia" w:hAnsi="Cambria" w:cs="Times New Roman"/>
+        </w:rPr>
+        <w:t>d 0.</w:t>
+      </w:r>
+      <w:r>
+        <w:rPr>
+          <w:rFonts w:ascii="Cambria" w:eastAsiaTheme="minorEastAsia" w:hAnsi="Cambria" w:cs="Times New Roman"/>
+        </w:rPr>
+        <w:t xml:space="preserve">91 (all working conditions) compared </w:t>
+      </w:r>
+      <w:r>
+        <w:rPr>
+          <w:rFonts w:ascii="Cambria" w:eastAsiaTheme="minorEastAsia" w:hAnsi="Cambria" w:cs="Times New Roman"/>
+        </w:rPr>
+        <w:t xml:space="preserve">to the dataset trained directly on the catalogue (range between </w:t>
+      </w:r>
+      <w:r>
+        <w:rPr>
+          <w:rFonts w:ascii="Cambria" w:eastAsiaTheme="minorEastAsia" w:hAnsi="Cambria" w:cs="Times New Roman"/>
+        </w:rPr>
+        <w:t>0.57 to 0.92).</w:t>
       </w:r>
     </w:p>
     <w:p>
@@ -3898,7 +4499,7 @@
         <w:pStyle w:val="Paragrafoelenco"/>
         <w:numPr>
           <w:ilvl w:val="0"/>
-          <w:numId w:val="5"/>
+          <w:numId w:val="7"/>
         </w:numPr>
         <w:jc w:val="both"/>
         <w:rPr>
@@ -3909,25 +4510,25 @@
         <w:rPr>
           <w:rFonts w:ascii="Cambria" w:eastAsiaTheme="minorEastAsia" w:hAnsi="Cambria" w:cs="Times New Roman"/>
         </w:rPr>
-        <w:t xml:space="preserve">In all almost all models, the </w:t>
-      </w:r>
-      <w:r>
-        <w:rPr>
-          <w:rFonts w:ascii="Cambria" w:eastAsiaTheme="minorEastAsia" w:hAnsi="Cambria" w:cs="Times New Roman"/>
-        </w:rPr>
-        <w:t xml:space="preserve">predictions are better in the stationary regime compared to the functioning </w:t>
-      </w:r>
-      <w:r>
-        <w:rPr>
-          <w:rFonts w:ascii="Cambria" w:eastAsiaTheme="minorEastAsia" w:hAnsi="Cambria" w:cs="Times New Roman"/>
-        </w:rPr>
-        <w:t xml:space="preserve">considering even defrost, DHW, acceleration and deceleration </w:t>
-      </w:r>
-      <w:r>
-        <w:rPr>
-          <w:rFonts w:ascii="Cambria" w:eastAsiaTheme="minorEastAsia" w:hAnsi="Cambria" w:cs="Times New Roman"/>
-        </w:rPr>
-        <w:t>are always better. The model is more precise when predicts the stationary conditions.</w:t>
+        <w:t xml:space="preserve">For the SCOP, the values are almost identical between the simulated values and the modelled ones with the overall operative conditions. This indicates the </w:t>
+      </w:r>
+      <w:r>
+        <w:rPr>
+          <w:rFonts w:ascii="Cambria" w:eastAsiaTheme="minorEastAsia" w:hAnsi="Cambria" w:cs="Times New Roman"/>
+        </w:rPr>
+        <w:t>model is robust and performs well if it is trained with the correct amount of data</w:t>
+      </w:r>
+      <w:r>
+        <w:rPr>
+          <w:rFonts w:ascii="Cambria" w:eastAsiaTheme="minorEastAsia" w:hAnsi="Cambria" w:cs="Times New Roman"/>
+        </w:rPr>
+        <w:t xml:space="preserve"> which space inside the overall range of work of the compressor.</w:t>
+      </w:r>
+      <w:r>
+        <w:rPr>
+          <w:rFonts w:ascii="Cambria" w:eastAsiaTheme="minorEastAsia" w:hAnsi="Cambria" w:cs="Times New Roman"/>
+        </w:rPr>
+        <w:t xml:space="preserve"> </w:t>
       </w:r>
     </w:p>
     <w:p>
@@ -3935,7 +4536,7 @@
         <w:pStyle w:val="Paragrafoelenco"/>
         <w:numPr>
           <w:ilvl w:val="0"/>
-          <w:numId w:val="5"/>
+          <w:numId w:val="6"/>
         </w:numPr>
         <w:jc w:val="both"/>
         <w:rPr>
@@ -3946,31 +4547,31 @@
         <w:rPr>
           <w:rFonts w:ascii="Cambria" w:eastAsiaTheme="minorEastAsia" w:hAnsi="Cambria" w:cs="Times New Roman"/>
         </w:rPr>
-        <w:t xml:space="preserve">The SCOP is higher in the stationary </w:t>
-      </w:r>
-      <w:r>
-        <w:rPr>
-          <w:rFonts w:ascii="Cambria" w:eastAsiaTheme="minorEastAsia" w:hAnsi="Cambria" w:cs="Times New Roman"/>
-        </w:rPr>
-        <w:t xml:space="preserve">regime compare to the other. The SCOP of the geothermal HP is </w:t>
-      </w:r>
-      <w:r>
-        <w:rPr>
-          <w:rFonts w:ascii="Cambria" w:eastAsiaTheme="minorEastAsia" w:hAnsi="Cambria" w:cs="Times New Roman"/>
-        </w:rPr>
-        <w:t xml:space="preserve">the highest compare to the installation ID 2050. In case of geothermal HPs, the source </w:t>
-      </w:r>
-      <w:r>
-        <w:rPr>
-          <w:rFonts w:ascii="Cambria" w:eastAsiaTheme="minorEastAsia" w:hAnsi="Cambria" w:cs="Times New Roman"/>
-        </w:rPr>
-        <w:t xml:space="preserve">temperature is not related to the outdoor temperature, but to the temperature of the </w:t>
-      </w:r>
-      <w:r>
-        <w:rPr>
-          <w:rFonts w:ascii="Cambria" w:eastAsiaTheme="minorEastAsia" w:hAnsi="Cambria" w:cs="Times New Roman"/>
-        </w:rPr>
-        <w:t>water – glycol mixture flowing through the evaporator.</w:t>
+        <w:t xml:space="preserve">The </w:t>
+      </w:r>
+      <w:r>
+        <w:rPr>
+          <w:rFonts w:ascii="Cambria" w:eastAsiaTheme="minorEastAsia" w:hAnsi="Cambria" w:cs="Times New Roman"/>
+        </w:rPr>
+        <w:t>R2 for</w:t>
+      </w:r>
+      <w:r>
+        <w:rPr>
+          <w:rFonts w:ascii="Cambria" w:eastAsiaTheme="minorEastAsia" w:hAnsi="Cambria" w:cs="Times New Roman"/>
+        </w:rPr>
+        <w:t xml:space="preserve"> the VA+ are very similar, with differences lower than</w:t>
+      </w:r>
+      <w:r>
+        <w:rPr>
+          <w:rFonts w:ascii="Cambria" w:eastAsiaTheme="minorEastAsia" w:hAnsi="Cambria" w:cs="Times New Roman"/>
+        </w:rPr>
+        <w:t xml:space="preserve"> 7% in every case</w:t>
+      </w:r>
+      <w:r>
+        <w:rPr>
+          <w:rFonts w:ascii="Cambria" w:eastAsiaTheme="minorEastAsia" w:hAnsi="Cambria" w:cs="Times New Roman"/>
+        </w:rPr>
+        <w:t>.</w:t>
       </w:r>
     </w:p>
     <w:p>
@@ -3978,7 +4579,7 @@
         <w:pStyle w:val="Paragrafoelenco"/>
         <w:numPr>
           <w:ilvl w:val="0"/>
-          <w:numId w:val="5"/>
+          <w:numId w:val="6"/>
         </w:numPr>
         <w:jc w:val="both"/>
         <w:rPr>
@@ -3989,14 +4590,19 @@
         <w:rPr>
           <w:rFonts w:ascii="Cambria" w:eastAsiaTheme="minorEastAsia" w:hAnsi="Cambria" w:cs="Times New Roman"/>
         </w:rPr>
-        <w:lastRenderedPageBreak/>
-        <w:t>The models which fails the most in the prediction of the SCOP are the ones which have a l</w:t>
-      </w:r>
-      <w:r>
-        <w:rPr>
-          <w:rFonts w:ascii="Cambria" w:eastAsiaTheme="minorEastAsia" w:hAnsi="Cambria" w:cs="Times New Roman"/>
-        </w:rPr>
-        <w:t>ower amount of points in partial load operation.</w:t>
+        <w:t>The R2 for the Riello</w:t>
+      </w:r>
+      <w:r>
+        <w:rPr>
+          <w:rFonts w:ascii="Cambria" w:eastAsiaTheme="minorEastAsia" w:hAnsi="Cambria" w:cs="Times New Roman"/>
+        </w:rPr>
+        <w:t xml:space="preserve"> NXHM is</w:t>
+      </w:r>
+      <w:r>
+        <w:rPr>
+          <w:rFonts w:ascii="Cambria" w:eastAsiaTheme="minorEastAsia" w:hAnsi="Cambria" w:cs="Times New Roman"/>
+        </w:rPr>
+        <w:t xml:space="preserve"> similar, with differences lower than 10% in every case.</w:t>
       </w:r>
     </w:p>
     <w:p>
@@ -4004,7 +4610,7 @@
         <w:pStyle w:val="Paragrafoelenco"/>
         <w:numPr>
           <w:ilvl w:val="0"/>
-          <w:numId w:val="5"/>
+          <w:numId w:val="6"/>
         </w:numPr>
         <w:jc w:val="both"/>
         <w:rPr>
@@ -4015,19 +4621,119 @@
         <w:rPr>
           <w:rFonts w:ascii="Cambria" w:eastAsiaTheme="minorEastAsia" w:hAnsi="Cambria" w:cs="Times New Roman"/>
         </w:rPr>
-        <w:t xml:space="preserve">In order to work, the model requires </w:t>
-      </w:r>
-      <w:r>
-        <w:rPr>
-          <w:rFonts w:ascii="Cambria" w:eastAsiaTheme="minorEastAsia" w:hAnsi="Cambria" w:cs="Times New Roman"/>
-        </w:rPr>
-        <w:t xml:space="preserve">at least 4 – 5 points in partial load and the corresponding points in full load (a total amount of 8 points). The points should be taken with </w:t>
-      </w:r>
-      <w:r>
-        <w:rPr>
-          <w:rFonts w:ascii="Cambria" w:eastAsiaTheme="minorEastAsia" w:hAnsi="Cambria" w:cs="Times New Roman"/>
-        </w:rPr>
-        <w:t xml:space="preserve">different combinations of SET and LExT in order to cover a good part of the envelope. </w:t>
+        <w:t xml:space="preserve">For </w:t>
+      </w:r>
+      <w:r>
+        <w:rPr>
+          <w:rFonts w:ascii="Cambria" w:eastAsiaTheme="minorEastAsia" w:hAnsi="Cambria" w:cs="Times New Roman"/>
+        </w:rPr>
+        <w:t xml:space="preserve">NIBE F2040, the maximum difference is around 30%. </w:t>
+      </w:r>
+      <w:r>
+        <w:rPr>
+          <w:rFonts w:ascii="Cambria" w:eastAsiaTheme="minorEastAsia" w:hAnsi="Cambria" w:cs="Times New Roman"/>
+        </w:rPr>
+        <w:t xml:space="preserve">This machine is the one that performs worse compared to the case trained with the Machine Learning approach. The reason </w:t>
+      </w:r>
+      <w:r>
+        <w:rPr>
+          <w:rFonts w:ascii="Cambria" w:eastAsiaTheme="minorEastAsia" w:hAnsi="Cambria" w:cs="Times New Roman"/>
+        </w:rPr>
+        <w:t>is the training dataset</w:t>
+      </w:r>
+      <w:r>
+        <w:rPr>
+          <w:rFonts w:ascii="Cambria" w:eastAsiaTheme="minorEastAsia" w:hAnsi="Cambria" w:cs="Times New Roman"/>
+        </w:rPr>
+        <w:t>: this machine ha</w:t>
+      </w:r>
+      <w:r>
+        <w:rPr>
+          <w:rFonts w:ascii="Cambria" w:eastAsiaTheme="minorEastAsia" w:hAnsi="Cambria" w:cs="Times New Roman"/>
+        </w:rPr>
+        <w:t xml:space="preserve">s </w:t>
+      </w:r>
+      <w:r>
+        <w:rPr>
+          <w:rFonts w:ascii="Cambria" w:eastAsiaTheme="minorEastAsia" w:hAnsi="Cambria" w:cs="Times New Roman"/>
+        </w:rPr>
+        <w:t xml:space="preserve">as training points </w:t>
+      </w:r>
+      <w:r>
+        <w:rPr>
+          <w:rFonts w:ascii="Cambria" w:eastAsiaTheme="minorEastAsia" w:hAnsi="Cambria" w:cs="Times New Roman"/>
+        </w:rPr>
+        <w:t xml:space="preserve">in partial load working conditions with </w:t>
+      </w:r>
+      <w:r>
+        <w:rPr>
+          <w:rFonts w:ascii="Cambria" w:eastAsiaTheme="minorEastAsia" w:hAnsi="Cambria" w:cs="Times New Roman"/>
+        </w:rPr>
+        <w:t xml:space="preserve">LExT </w:t>
+      </w:r>
+      <w:r>
+        <w:rPr>
+          <w:rFonts w:ascii="Cambria" w:eastAsiaTheme="minorEastAsia" w:hAnsi="Cambria" w:cs="Times New Roman"/>
+        </w:rPr>
+        <w:t xml:space="preserve">equals to 55°C. This condition is never reached in the real operation of the unit (with the </w:t>
+      </w:r>
+      <w:proofErr w:type="spellStart"/>
+      <w:r>
+        <w:rPr>
+          <w:rFonts w:ascii="Cambria" w:eastAsiaTheme="minorEastAsia" w:hAnsi="Cambria" w:cs="Times New Roman"/>
+        </w:rPr>
+        <w:t>exeption</w:t>
+      </w:r>
+      <w:proofErr w:type="spellEnd"/>
+      <w:r>
+        <w:rPr>
+          <w:rFonts w:ascii="Cambria" w:eastAsiaTheme="minorEastAsia" w:hAnsi="Cambria" w:cs="Times New Roman"/>
+        </w:rPr>
+        <w:t xml:space="preserve"> of the </w:t>
+      </w:r>
+      <w:r>
+        <w:rPr>
+          <w:rFonts w:ascii="Cambria" w:eastAsiaTheme="minorEastAsia" w:hAnsi="Cambria" w:cs="Times New Roman"/>
+        </w:rPr>
+        <w:t>DHW</w:t>
+      </w:r>
+      <w:r>
+        <w:rPr>
+          <w:rFonts w:ascii="Cambria" w:eastAsiaTheme="minorEastAsia" w:hAnsi="Cambria" w:cs="Times New Roman"/>
+        </w:rPr>
+        <w:t xml:space="preserve"> generation</w:t>
+      </w:r>
+      <w:r>
+        <w:rPr>
+          <w:rFonts w:ascii="Cambria" w:eastAsiaTheme="minorEastAsia" w:hAnsi="Cambria" w:cs="Times New Roman"/>
+        </w:rPr>
+        <w:t>)</w:t>
+      </w:r>
+      <w:r>
+        <w:rPr>
+          <w:rFonts w:ascii="Cambria" w:eastAsiaTheme="minorEastAsia" w:hAnsi="Cambria" w:cs="Times New Roman"/>
+        </w:rPr>
+        <w:t xml:space="preserve"> since the </w:t>
+      </w:r>
+      <w:proofErr w:type="spellStart"/>
+      <w:r>
+        <w:rPr>
+          <w:rFonts w:ascii="Cambria" w:eastAsiaTheme="minorEastAsia" w:hAnsi="Cambria" w:cs="Times New Roman"/>
+        </w:rPr>
+        <w:t>desing</w:t>
+      </w:r>
+      <w:proofErr w:type="spellEnd"/>
+      <w:r>
+        <w:rPr>
+          <w:rFonts w:ascii="Cambria" w:eastAsiaTheme="minorEastAsia" w:hAnsi="Cambria" w:cs="Times New Roman"/>
+        </w:rPr>
+        <w:t xml:space="preserve"> temperature for this installation is </w:t>
+      </w:r>
+      <w:r>
+        <w:rPr>
+          <w:rFonts w:ascii="Cambria" w:eastAsiaTheme="minorEastAsia" w:hAnsi="Cambria" w:cs="Times New Roman"/>
+        </w:rPr>
+        <w:t>45°C.</w:t>
       </w:r>
     </w:p>
     <w:p>
@@ -4035,7 +4741,7 @@
         <w:pStyle w:val="Paragrafoelenco"/>
         <w:numPr>
           <w:ilvl w:val="0"/>
-          <w:numId w:val="5"/>
+          <w:numId w:val="6"/>
         </w:numPr>
         <w:jc w:val="both"/>
         <w:rPr>
@@ -4046,13 +4752,13 @@
         <w:rPr>
           <w:rFonts w:ascii="Cambria" w:eastAsiaTheme="minorEastAsia" w:hAnsi="Cambria" w:cs="Times New Roman"/>
         </w:rPr>
-        <w:t>The transitory regime</w:t>
-      </w:r>
-      <w:r>
-        <w:rPr>
-          <w:rFonts w:ascii="Cambria" w:eastAsiaTheme="minorEastAsia" w:hAnsi="Cambria" w:cs="Times New Roman"/>
-        </w:rPr>
-        <w:t xml:space="preserve"> have an effect on the SCOP, decreasing the performance of the unit all over the periods analysed. </w:t>
+        <w:t>For the Geothermal Heat Pump MT AQ30</w:t>
+      </w:r>
+      <w:r>
+        <w:rPr>
+          <w:rFonts w:ascii="Cambria" w:eastAsiaTheme="minorEastAsia" w:hAnsi="Cambria" w:cs="Times New Roman"/>
+        </w:rPr>
+        <w:t>I,</w:t>
       </w:r>
       <w:r>
         <w:rPr>
@@ -4064,62 +4770,78 @@
         <w:rPr>
           <w:rFonts w:ascii="Cambria" w:eastAsiaTheme="minorEastAsia" w:hAnsi="Cambria" w:cs="Times New Roman"/>
         </w:rPr>
-        <w:t>To predict the coefficient of performance of the unit in partial load operation during the transitory regimes, it would be necessary to analyse that specific states.</w:t>
-      </w:r>
-    </w:p>
-    <w:p>
-      <w:pPr>
-        <w:jc w:val="both"/>
-        <w:rPr>
-          <w:rFonts w:ascii="Cambria" w:eastAsiaTheme="minorEastAsia" w:hAnsi="Cambria" w:cs="Times New Roman"/>
-        </w:rPr>
-      </w:pPr>
-    </w:p>
-    <w:p>
-      <w:pPr>
-        <w:jc w:val="both"/>
-        <w:rPr>
-          <w:rFonts w:ascii="Cambria" w:eastAsiaTheme="minorEastAsia" w:hAnsi="Cambria" w:cs="Times New Roman"/>
-        </w:rPr>
-      </w:pPr>
-    </w:p>
-    <w:p>
-      <w:pPr>
-        <w:jc w:val="both"/>
-        <w:rPr>
-          <w:rFonts w:ascii="Cambria" w:eastAsiaTheme="minorEastAsia" w:hAnsi="Cambria" w:cs="Times New Roman"/>
-        </w:rPr>
-      </w:pPr>
-      <w:r>
-        <w:rPr>
-          <w:rFonts w:ascii="Cambria" w:eastAsiaTheme="minorEastAsia" w:hAnsi="Cambria" w:cs="Times New Roman"/>
-        </w:rPr>
-        <w:t xml:space="preserve"> </w:t>
-      </w:r>
-    </w:p>
-    <w:p>
-      <w:pPr>
-        <w:jc w:val="both"/>
-        <w:rPr>
-          <w:rFonts w:ascii="Cambria" w:eastAsiaTheme="minorEastAsia" w:hAnsi="Cambria" w:cs="Times New Roman"/>
-        </w:rPr>
-      </w:pPr>
-    </w:p>
-    <w:p>
-      <w:pPr>
-        <w:jc w:val="both"/>
-        <w:rPr>
-          <w:rFonts w:ascii="Cambria" w:eastAsiaTheme="minorEastAsia" w:hAnsi="Cambria" w:cs="Times New Roman"/>
-        </w:rPr>
-      </w:pPr>
-    </w:p>
-    <w:p>
-      <w:pPr>
-        <w:jc w:val="center"/>
-        <w:rPr>
-          <w:rFonts w:ascii="Cambria" w:hAnsi="Cambria" w:cs="Times New Roman"/>
-        </w:rPr>
-      </w:pPr>
+        <w:t xml:space="preserve">the maximum difference is around </w:t>
+      </w:r>
+      <w:r>
+        <w:rPr>
+          <w:rFonts w:ascii="Cambria" w:eastAsiaTheme="minorEastAsia" w:hAnsi="Cambria" w:cs="Times New Roman"/>
+        </w:rPr>
+        <w:t>12%</w:t>
+      </w:r>
+      <w:r>
+        <w:rPr>
+          <w:rFonts w:ascii="Cambria" w:eastAsiaTheme="minorEastAsia" w:hAnsi="Cambria" w:cs="Times New Roman"/>
+        </w:rPr>
+        <w:t>. The R2 is not so high compared to the Air to Water units.</w:t>
+      </w:r>
+      <w:r>
+        <w:rPr>
+          <w:rFonts w:ascii="Cambria" w:eastAsiaTheme="minorEastAsia" w:hAnsi="Cambria" w:cs="Times New Roman"/>
+        </w:rPr>
+        <w:t xml:space="preserve"> Even in this case, the </w:t>
+      </w:r>
+      <w:r>
+        <w:rPr>
+          <w:rFonts w:ascii="Cambria" w:eastAsiaTheme="minorEastAsia" w:hAnsi="Cambria" w:cs="Times New Roman"/>
+        </w:rPr>
+        <w:t xml:space="preserve">reason could be related to the working points. </w:t>
+      </w:r>
+      <w:r>
+        <w:rPr>
+          <w:rFonts w:ascii="Cambria" w:eastAsiaTheme="minorEastAsia" w:hAnsi="Cambria" w:cs="Times New Roman"/>
+        </w:rPr>
+        <w:t xml:space="preserve">Indeed, for </w:t>
+      </w:r>
+      <w:proofErr w:type="gramStart"/>
+      <w:r>
+        <w:rPr>
+          <w:rFonts w:ascii="Cambria" w:eastAsiaTheme="minorEastAsia" w:hAnsi="Cambria" w:cs="Times New Roman"/>
+        </w:rPr>
+        <w:t>the vast majority of</w:t>
+      </w:r>
+      <w:proofErr w:type="gramEnd"/>
+      <w:r>
+        <w:rPr>
+          <w:rFonts w:ascii="Cambria" w:eastAsiaTheme="minorEastAsia" w:hAnsi="Cambria" w:cs="Times New Roman"/>
+        </w:rPr>
+        <w:t xml:space="preserve"> time, the unit perf</w:t>
+      </w:r>
+      <w:r>
+        <w:rPr>
+          <w:rFonts w:ascii="Cambria" w:eastAsiaTheme="minorEastAsia" w:hAnsi="Cambria" w:cs="Times New Roman"/>
+        </w:rPr>
+        <w:t xml:space="preserve">orms at </w:t>
+      </w:r>
+      <w:proofErr w:type="spellStart"/>
+      <w:r>
+        <w:rPr>
+          <w:rFonts w:ascii="Cambria" w:eastAsiaTheme="minorEastAsia" w:hAnsi="Cambria" w:cs="Times New Roman"/>
+        </w:rPr>
+        <w:t>termperatures</w:t>
+      </w:r>
+      <w:proofErr w:type="spellEnd"/>
+      <w:r>
+        <w:rPr>
+          <w:rFonts w:ascii="Cambria" w:eastAsiaTheme="minorEastAsia" w:hAnsi="Cambria" w:cs="Times New Roman"/>
+        </w:rPr>
+        <w:t xml:space="preserve"> which are lower than 45°C but also lower than 35°C. This can lead t</w:t>
+      </w:r>
+      <w:r>
+        <w:rPr>
+          <w:rFonts w:ascii="Cambria" w:eastAsiaTheme="minorEastAsia" w:hAnsi="Cambria" w:cs="Times New Roman"/>
+        </w:rPr>
+        <w:t>he training on the wrong fitting, decreasing the performance of the machine.</w:t>
+      </w:r>
     </w:p>
     <w:sectPr>
       <w:pgSz w:w="11906" w:h="16838"/>
@@ -4446,9 +5168,9 @@
     </w:lvl>
   </w:abstractNum>
   <w:abstractNum w:abstractNumId="3" w15:restartNumberingAfterBreak="0">
-    <w:nsid w:val="4D4F204F"/>
+    <w:nsid w:val="1D9509CF"/>
     <w:multiLevelType w:val="hybridMultilevel"/>
-    <w:tmpl w:val="810E79C8"/>
+    <w:tmpl w:val="F8546458"/>
     <w:lvl w:ilvl="0" w:tplc="04100001">
       <w:start w:val="1"/>
       <w:numFmt w:val="bullet"/>
@@ -4559,6 +5281,232 @@
     </w:lvl>
   </w:abstractNum>
   <w:abstractNum w:abstractNumId="4" w15:restartNumberingAfterBreak="0">
+    <w:nsid w:val="49545C26"/>
+    <w:multiLevelType w:val="hybridMultilevel"/>
+    <w:tmpl w:val="E8607228"/>
+    <w:lvl w:ilvl="0" w:tplc="04100001">
+      <w:start w:val="1"/>
+      <w:numFmt w:val="bullet"/>
+      <w:lvlText w:val=""/>
+      <w:lvlJc w:val="left"/>
+      <w:pPr>
+        <w:ind w:left="720" w:hanging="360"/>
+      </w:pPr>
+      <w:rPr>
+        <w:rFonts w:ascii="Symbol" w:hAnsi="Symbol" w:hint="default"/>
+      </w:rPr>
+    </w:lvl>
+    <w:lvl w:ilvl="1" w:tplc="04100003" w:tentative="1">
+      <w:start w:val="1"/>
+      <w:numFmt w:val="bullet"/>
+      <w:lvlText w:val="o"/>
+      <w:lvlJc w:val="left"/>
+      <w:pPr>
+        <w:ind w:left="1440" w:hanging="360"/>
+      </w:pPr>
+      <w:rPr>
+        <w:rFonts w:ascii="Courier New" w:hAnsi="Courier New" w:cs="Courier New" w:hint="default"/>
+      </w:rPr>
+    </w:lvl>
+    <w:lvl w:ilvl="2" w:tplc="04100005" w:tentative="1">
+      <w:start w:val="1"/>
+      <w:numFmt w:val="bullet"/>
+      <w:lvlText w:val=""/>
+      <w:lvlJc w:val="left"/>
+      <w:pPr>
+        <w:ind w:left="2160" w:hanging="360"/>
+      </w:pPr>
+      <w:rPr>
+        <w:rFonts w:ascii="Wingdings" w:hAnsi="Wingdings" w:hint="default"/>
+      </w:rPr>
+    </w:lvl>
+    <w:lvl w:ilvl="3" w:tplc="04100001" w:tentative="1">
+      <w:start w:val="1"/>
+      <w:numFmt w:val="bullet"/>
+      <w:lvlText w:val=""/>
+      <w:lvlJc w:val="left"/>
+      <w:pPr>
+        <w:ind w:left="2880" w:hanging="360"/>
+      </w:pPr>
+      <w:rPr>
+        <w:rFonts w:ascii="Symbol" w:hAnsi="Symbol" w:hint="default"/>
+      </w:rPr>
+    </w:lvl>
+    <w:lvl w:ilvl="4" w:tplc="04100003" w:tentative="1">
+      <w:start w:val="1"/>
+      <w:numFmt w:val="bullet"/>
+      <w:lvlText w:val="o"/>
+      <w:lvlJc w:val="left"/>
+      <w:pPr>
+        <w:ind w:left="3600" w:hanging="360"/>
+      </w:pPr>
+      <w:rPr>
+        <w:rFonts w:ascii="Courier New" w:hAnsi="Courier New" w:cs="Courier New" w:hint="default"/>
+      </w:rPr>
+    </w:lvl>
+    <w:lvl w:ilvl="5" w:tplc="04100005" w:tentative="1">
+      <w:start w:val="1"/>
+      <w:numFmt w:val="bullet"/>
+      <w:lvlText w:val=""/>
+      <w:lvlJc w:val="left"/>
+      <w:pPr>
+        <w:ind w:left="4320" w:hanging="360"/>
+      </w:pPr>
+      <w:rPr>
+        <w:rFonts w:ascii="Wingdings" w:hAnsi="Wingdings" w:hint="default"/>
+      </w:rPr>
+    </w:lvl>
+    <w:lvl w:ilvl="6" w:tplc="04100001" w:tentative="1">
+      <w:start w:val="1"/>
+      <w:numFmt w:val="bullet"/>
+      <w:lvlText w:val=""/>
+      <w:lvlJc w:val="left"/>
+      <w:pPr>
+        <w:ind w:left="5040" w:hanging="360"/>
+      </w:pPr>
+      <w:rPr>
+        <w:rFonts w:ascii="Symbol" w:hAnsi="Symbol" w:hint="default"/>
+      </w:rPr>
+    </w:lvl>
+    <w:lvl w:ilvl="7" w:tplc="04100003" w:tentative="1">
+      <w:start w:val="1"/>
+      <w:numFmt w:val="bullet"/>
+      <w:lvlText w:val="o"/>
+      <w:lvlJc w:val="left"/>
+      <w:pPr>
+        <w:ind w:left="5760" w:hanging="360"/>
+      </w:pPr>
+      <w:rPr>
+        <w:rFonts w:ascii="Courier New" w:hAnsi="Courier New" w:cs="Courier New" w:hint="default"/>
+      </w:rPr>
+    </w:lvl>
+    <w:lvl w:ilvl="8" w:tplc="04100005" w:tentative="1">
+      <w:start w:val="1"/>
+      <w:numFmt w:val="bullet"/>
+      <w:lvlText w:val=""/>
+      <w:lvlJc w:val="left"/>
+      <w:pPr>
+        <w:ind w:left="6480" w:hanging="360"/>
+      </w:pPr>
+      <w:rPr>
+        <w:rFonts w:ascii="Wingdings" w:hAnsi="Wingdings" w:hint="default"/>
+      </w:rPr>
+    </w:lvl>
+  </w:abstractNum>
+  <w:abstractNum w:abstractNumId="5" w15:restartNumberingAfterBreak="0">
+    <w:nsid w:val="4D4F204F"/>
+    <w:multiLevelType w:val="hybridMultilevel"/>
+    <w:tmpl w:val="810E79C8"/>
+    <w:lvl w:ilvl="0" w:tplc="04100001">
+      <w:start w:val="1"/>
+      <w:numFmt w:val="bullet"/>
+      <w:lvlText w:val=""/>
+      <w:lvlJc w:val="left"/>
+      <w:pPr>
+        <w:ind w:left="720" w:hanging="360"/>
+      </w:pPr>
+      <w:rPr>
+        <w:rFonts w:ascii="Symbol" w:hAnsi="Symbol" w:hint="default"/>
+      </w:rPr>
+    </w:lvl>
+    <w:lvl w:ilvl="1" w:tplc="04100003" w:tentative="1">
+      <w:start w:val="1"/>
+      <w:numFmt w:val="bullet"/>
+      <w:lvlText w:val="o"/>
+      <w:lvlJc w:val="left"/>
+      <w:pPr>
+        <w:ind w:left="1440" w:hanging="360"/>
+      </w:pPr>
+      <w:rPr>
+        <w:rFonts w:ascii="Courier New" w:hAnsi="Courier New" w:cs="Courier New" w:hint="default"/>
+      </w:rPr>
+    </w:lvl>
+    <w:lvl w:ilvl="2" w:tplc="04100005" w:tentative="1">
+      <w:start w:val="1"/>
+      <w:numFmt w:val="bullet"/>
+      <w:lvlText w:val=""/>
+      <w:lvlJc w:val="left"/>
+      <w:pPr>
+        <w:ind w:left="2160" w:hanging="360"/>
+      </w:pPr>
+      <w:rPr>
+        <w:rFonts w:ascii="Wingdings" w:hAnsi="Wingdings" w:hint="default"/>
+      </w:rPr>
+    </w:lvl>
+    <w:lvl w:ilvl="3" w:tplc="04100001" w:tentative="1">
+      <w:start w:val="1"/>
+      <w:numFmt w:val="bullet"/>
+      <w:lvlText w:val=""/>
+      <w:lvlJc w:val="left"/>
+      <w:pPr>
+        <w:ind w:left="2880" w:hanging="360"/>
+      </w:pPr>
+      <w:rPr>
+        <w:rFonts w:ascii="Symbol" w:hAnsi="Symbol" w:hint="default"/>
+      </w:rPr>
+    </w:lvl>
+    <w:lvl w:ilvl="4" w:tplc="04100003" w:tentative="1">
+      <w:start w:val="1"/>
+      <w:numFmt w:val="bullet"/>
+      <w:lvlText w:val="o"/>
+      <w:lvlJc w:val="left"/>
+      <w:pPr>
+        <w:ind w:left="3600" w:hanging="360"/>
+      </w:pPr>
+      <w:rPr>
+        <w:rFonts w:ascii="Courier New" w:hAnsi="Courier New" w:cs="Courier New" w:hint="default"/>
+      </w:rPr>
+    </w:lvl>
+    <w:lvl w:ilvl="5" w:tplc="04100005" w:tentative="1">
+      <w:start w:val="1"/>
+      <w:numFmt w:val="bullet"/>
+      <w:lvlText w:val=""/>
+      <w:lvlJc w:val="left"/>
+      <w:pPr>
+        <w:ind w:left="4320" w:hanging="360"/>
+      </w:pPr>
+      <w:rPr>
+        <w:rFonts w:ascii="Wingdings" w:hAnsi="Wingdings" w:hint="default"/>
+      </w:rPr>
+    </w:lvl>
+    <w:lvl w:ilvl="6" w:tplc="04100001" w:tentative="1">
+      <w:start w:val="1"/>
+      <w:numFmt w:val="bullet"/>
+      <w:lvlText w:val=""/>
+      <w:lvlJc w:val="left"/>
+      <w:pPr>
+        <w:ind w:left="5040" w:hanging="360"/>
+      </w:pPr>
+      <w:rPr>
+        <w:rFonts w:ascii="Symbol" w:hAnsi="Symbol" w:hint="default"/>
+      </w:rPr>
+    </w:lvl>
+    <w:lvl w:ilvl="7" w:tplc="04100003" w:tentative="1">
+      <w:start w:val="1"/>
+      <w:numFmt w:val="bullet"/>
+      <w:lvlText w:val="o"/>
+      <w:lvlJc w:val="left"/>
+      <w:pPr>
+        <w:ind w:left="5760" w:hanging="360"/>
+      </w:pPr>
+      <w:rPr>
+        <w:rFonts w:ascii="Courier New" w:hAnsi="Courier New" w:cs="Courier New" w:hint="default"/>
+      </w:rPr>
+    </w:lvl>
+    <w:lvl w:ilvl="8" w:tplc="04100005" w:tentative="1">
+      <w:start w:val="1"/>
+      <w:numFmt w:val="bullet"/>
+      <w:lvlText w:val=""/>
+      <w:lvlJc w:val="left"/>
+      <w:pPr>
+        <w:ind w:left="6480" w:hanging="360"/>
+      </w:pPr>
+      <w:rPr>
+        <w:rFonts w:ascii="Wingdings" w:hAnsi="Wingdings" w:hint="default"/>
+      </w:rPr>
+    </w:lvl>
+  </w:abstractNum>
+  <w:abstractNum w:abstractNumId="6" w15:restartNumberingAfterBreak="0">
     <w:nsid w:val="68803E7C"/>
     <w:multiLevelType w:val="hybridMultilevel"/>
     <w:tmpl w:val="B644FD6E"/>
@@ -4645,7 +5593,7 @@
     </w:lvl>
   </w:abstractNum>
   <w:num w:numId="1" w16cid:durableId="766190923">
-    <w:abstractNumId w:val="4"/>
+    <w:abstractNumId w:val="6"/>
   </w:num>
   <w:num w:numId="2" w16cid:durableId="2038893177">
     <w:abstractNumId w:val="0"/>
@@ -4657,7 +5605,13 @@
     <w:abstractNumId w:val="1"/>
   </w:num>
   <w:num w:numId="5" w16cid:durableId="304286895">
+    <w:abstractNumId w:val="5"/>
+  </w:num>
+  <w:num w:numId="6" w16cid:durableId="1510365991">
     <w:abstractNumId w:val="3"/>
+  </w:num>
+  <w:num w:numId="7" w16cid:durableId="23479031">
+    <w:abstractNumId w:val="4"/>
   </w:num>
 </w:numbering>
 </file>

</xml_diff>